<commit_message>
Made some changes to supervisor log till week 4
</commit_message>
<xml_diff>
--- a/Slides/Supervisor Log.docx
+++ b/Slides/Supervisor Log.docx
@@ -6951,6 +6951,12 @@
                               </w:rPr>
                               <w:t xml:space="preserve">1. </w:t>
                             </w:r>
+                            <w:r>
+                              <w:rPr>
+                                <w:lang w:val="en-US"/>
+                              </w:rPr>
+                              <w:t>Timing schedule page for admin to add or edit timing for opening and closing orders</w:t>
+                            </w:r>
                           </w:p>
                         </w:txbxContent>
                       </wps:txbx>
@@ -6985,6 +6991,12 @@
                           <w:lang w:val="en-US"/>
                         </w:rPr>
                         <w:t xml:space="preserve">1. </w:t>
+                      </w:r>
+                      <w:r>
+                        <w:rPr>
+                          <w:lang w:val="en-US"/>
+                        </w:rPr>
+                        <w:t>Timing schedule page for admin to add or edit timing for opening and closing orders</w:t>
                       </w:r>
                     </w:p>
                   </w:txbxContent>
@@ -7338,12 +7350,3079 @@
     </w:p>
     <w:p>
       <w:pPr>
-        <w:rPr>
-          <w:rFonts w:ascii="Times New Roman" w:hAnsi="Times New Roman"/>
-          <w:b/>
-          <w:sz w:val="24"/>
-        </w:rPr>
-      </w:pPr>
+        <w:jc w:val="center"/>
+        <w:rPr>
+          <w:rFonts w:ascii="Times New Roman" w:hAnsi="Times New Roman"/>
+          <w:b/>
+          <w:sz w:val="24"/>
+        </w:rPr>
+      </w:pPr>
+      <w:r>
+        <w:rPr>
+          <w:rFonts w:ascii="Times New Roman" w:hAnsi="Times New Roman"/>
+          <w:b/>
+          <w:sz w:val="32"/>
+          <w:szCs w:val="22"/>
+        </w:rPr>
+        <w:t>Weekly Supervisor Log</w:t>
+      </w:r>
+    </w:p>
+    <w:p>
+      <w:pPr>
+        <w:rPr>
+          <w:rFonts w:ascii="Times New Roman" w:hAnsi="Times New Roman"/>
+          <w:b/>
+          <w:sz w:val="24"/>
+        </w:rPr>
+      </w:pPr>
+    </w:p>
+    <w:p>
+      <w:pPr>
+        <w:rPr>
+          <w:rFonts w:ascii="Times New Roman" w:hAnsi="Times New Roman"/>
+          <w:bCs/>
+          <w:sz w:val="28"/>
+        </w:rPr>
+      </w:pPr>
+      <w:r>
+        <w:rPr>
+          <w:rFonts w:ascii="Times New Roman" w:hAnsi="Times New Roman"/>
+          <w:b/>
+          <w:sz w:val="28"/>
+        </w:rPr>
+        <w:t>Date</w:t>
+      </w:r>
+      <w:r>
+        <w:rPr>
+          <w:rFonts w:ascii="Times New Roman" w:hAnsi="Times New Roman"/>
+          <w:b/>
+          <w:sz w:val="28"/>
+        </w:rPr>
+        <w:t>:</w:t>
+      </w:r>
+      <w:r>
+        <w:rPr>
+          <w:rFonts w:ascii="Times New Roman" w:hAnsi="Times New Roman"/>
+          <w:bCs/>
+          <w:sz w:val="28"/>
+        </w:rPr>
+        <w:t>2026-05-1</w:t>
+      </w:r>
+      <w:r>
+        <w:rPr>
+          <w:rFonts w:ascii="Times New Roman" w:hAnsi="Times New Roman"/>
+          <w:bCs/>
+          <w:sz w:val="28"/>
+        </w:rPr>
+        <w:t>7</w:t>
+      </w:r>
+    </w:p>
+    <w:p>
+      <w:pPr>
+        <w:rPr>
+          <w:rFonts w:ascii="Times New Roman" w:hAnsi="Times New Roman"/>
+          <w:bCs/>
+          <w:sz w:val="28"/>
+        </w:rPr>
+      </w:pPr>
+      <w:r>
+        <w:rPr>
+          <w:rFonts w:ascii="Times New Roman" w:hAnsi="Times New Roman"/>
+          <w:b/>
+          <w:sz w:val="28"/>
+        </w:rPr>
+        <w:t>Project</w:t>
+      </w:r>
+      <w:r>
+        <w:rPr>
+          <w:rFonts w:ascii="Times New Roman" w:hAnsi="Times New Roman"/>
+          <w:b/>
+          <w:sz w:val="28"/>
+        </w:rPr>
+        <w:t xml:space="preserve"> Title:</w:t>
+      </w:r>
+      <w:r>
+        <w:rPr>
+          <w:rFonts w:ascii="Times New Roman" w:hAnsi="Times New Roman"/>
+          <w:b/>
+          <w:sz w:val="28"/>
+        </w:rPr>
+        <w:t xml:space="preserve"> Canteen Pre-order System</w:t>
+      </w:r>
+    </w:p>
+    <w:p>
+      <w:pPr>
+        <w:rPr>
+          <w:rFonts w:ascii="Times New Roman" w:hAnsi="Times New Roman"/>
+          <w:sz w:val="28"/>
+        </w:rPr>
+      </w:pPr>
+      <w:r>
+        <w:rPr>
+          <w:rFonts w:ascii="Times New Roman" w:hAnsi="Times New Roman"/>
+          <w:b/>
+          <w:sz w:val="28"/>
+        </w:rPr>
+        <w:t>Week Number:</w:t>
+      </w:r>
+      <w:r>
+        <w:rPr>
+          <w:rFonts w:ascii="Times New Roman" w:hAnsi="Times New Roman"/>
+          <w:b/>
+          <w:sz w:val="28"/>
+        </w:rPr>
+        <w:t xml:space="preserve"> </w:t>
+      </w:r>
+      <w:r>
+        <w:rPr>
+          <w:rFonts w:ascii="Times New Roman" w:hAnsi="Times New Roman"/>
+          <w:bCs/>
+          <w:sz w:val="28"/>
+        </w:rPr>
+        <w:t>4</w:t>
+      </w:r>
+    </w:p>
+    <w:p>
+      <w:pPr>
+        <w:rPr>
+          <w:rFonts w:ascii="Times New Roman" w:hAnsi="Times New Roman"/>
+          <w:b/>
+          <w:sz w:val="24"/>
+        </w:rPr>
+      </w:pPr>
+    </w:p>
+    <w:p>
+      <w:pPr>
+        <w:rPr>
+          <w:rFonts w:ascii="Times New Roman" w:hAnsi="Times New Roman"/>
+          <w:b/>
+          <w:sz w:val="24"/>
+        </w:rPr>
+      </w:pPr>
+      <w:r>
+        <w:rPr>
+          <w:rFonts w:ascii="Times New Roman" w:hAnsi="Times New Roman"/>
+          <w:b/>
+          <w:sz w:val="24"/>
+        </w:rPr>
+        <w:t>Activities</w:t>
+      </w:r>
+      <w:r>
+        <w:rPr>
+          <w:rFonts w:ascii="Times New Roman" w:hAnsi="Times New Roman"/>
+          <w:b/>
+          <w:sz w:val="24"/>
+        </w:rPr>
+        <w:t>:</w:t>
+      </w:r>
+    </w:p>
+    <w:p>
+      <w:pPr>
+        <w:rPr>
+          <w:rFonts w:ascii="Times New Roman" w:hAnsi="Times New Roman"/>
+          <w:b/>
+          <w:sz w:val="24"/>
+        </w:rPr>
+      </w:pPr>
+      <w:r>
+        <w:rPr>
+          <w:rFonts w:ascii="Times New Roman" w:hAnsi="Times New Roman"/>
+          <w:b/>
+          <w:sz w:val="24"/>
+        </w:rPr>
+        <w:t>Name: Shulabh Shrestha</w:t>
+      </w:r>
+    </w:p>
+    <w:p>
+      <w:pPr>
+        <w:rPr>
+          <w:rFonts w:ascii="Times New Roman" w:hAnsi="Times New Roman"/>
+          <w:b/>
+          <w:sz w:val="24"/>
+        </w:rPr>
+      </w:pPr>
+      <w:r>
+        <w:rPr>
+          <w:rFonts w:ascii="Times New Roman" w:hAnsi="Times New Roman"/>
+          <w:b/>
+          <w:sz w:val="24"/>
+        </w:rPr>
+        <w:t xml:space="preserve">In progress: </w:t>
+      </w:r>
+    </w:p>
+    <w:p>
+      <w:pPr>
+        <w:rPr>
+          <w:rFonts w:ascii="Times New Roman" w:hAnsi="Times New Roman"/>
+          <w:b/>
+          <w:sz w:val="24"/>
+        </w:rPr>
+      </w:pPr>
+      <w:r>
+        <w:rPr>
+          <w:rFonts w:ascii="Times New Roman" w:hAnsi="Times New Roman"/>
+          <w:b/>
+          <w:noProof/>
+          <w:sz w:val="24"/>
+          <w:lang w:eastAsia="en-GB" w:bidi="ne-NP"/>
+        </w:rPr>
+        <mc:AlternateContent>
+          <mc:Choice Requires="wps">
+            <w:drawing>
+              <wp:anchor distT="0" distB="0" distL="114300" distR="114300" simplePos="0" relativeHeight="251713536" behindDoc="0" locked="0" layoutInCell="1" allowOverlap="1" wp14:anchorId="4B741AEB" wp14:editId="403981F0">
+                <wp:simplePos x="0" y="0"/>
+                <wp:positionH relativeFrom="column">
+                  <wp:posOffset>9525</wp:posOffset>
+                </wp:positionH>
+                <wp:positionV relativeFrom="paragraph">
+                  <wp:posOffset>47625</wp:posOffset>
+                </wp:positionV>
+                <wp:extent cx="5857875" cy="1074420"/>
+                <wp:effectExtent l="9525" t="5715" r="9525" b="5715"/>
+                <wp:wrapNone/>
+                <wp:docPr id="97809196" name="Rectangle 8"/>
+                <wp:cNvGraphicFramePr>
+                  <a:graphicFrameLocks xmlns:a="http://schemas.openxmlformats.org/drawingml/2006/main"/>
+                </wp:cNvGraphicFramePr>
+                <a:graphic xmlns:a="http://schemas.openxmlformats.org/drawingml/2006/main">
+                  <a:graphicData uri="http://schemas.microsoft.com/office/word/2010/wordprocessingShape">
+                    <wps:wsp>
+                      <wps:cNvSpPr>
+                        <a:spLocks noChangeArrowheads="1"/>
+                      </wps:cNvSpPr>
+                      <wps:spPr bwMode="auto">
+                        <a:xfrm>
+                          <a:off x="0" y="0"/>
+                          <a:ext cx="5857875" cy="1074420"/>
+                        </a:xfrm>
+                        <a:prstGeom prst="rect">
+                          <a:avLst/>
+                        </a:prstGeom>
+                        <a:solidFill>
+                          <a:srgbClr val="FFFFFF"/>
+                        </a:solidFill>
+                        <a:ln w="9525">
+                          <a:solidFill>
+                            <a:srgbClr val="000000"/>
+                          </a:solidFill>
+                          <a:miter lim="800000"/>
+                          <a:headEnd/>
+                          <a:tailEnd/>
+                        </a:ln>
+                      </wps:spPr>
+                      <wps:txbx>
+                        <w:txbxContent>
+                          <w:p>
+                            <w:pPr>
+                              <w:rPr>
+                                <w:lang w:val="en-US"/>
+                              </w:rPr>
+                            </w:pPr>
+                            <w:r>
+                              <w:rPr>
+                                <w:lang w:val="en-US"/>
+                              </w:rPr>
+                              <w:t xml:space="preserve">1. </w:t>
+                            </w:r>
+                            <w:r>
+                              <w:rPr>
+                                <w:lang w:val="en-US"/>
+                              </w:rPr>
+                              <w:t>Add</w:t>
+                            </w:r>
+                            <w:r>
+                              <w:rPr>
+                                <w:lang w:val="en-US"/>
+                              </w:rPr>
+                              <w:t xml:space="preserve"> functionality for changing stock and deleting menu items</w:t>
+                            </w:r>
+                          </w:p>
+                        </w:txbxContent>
+                      </wps:txbx>
+                      <wps:bodyPr rot="0" vert="horz" wrap="square" lIns="91440" tIns="45720" rIns="91440" bIns="45720" anchor="t" anchorCtr="0" upright="1">
+                        <a:noAutofit/>
+                      </wps:bodyPr>
+                    </wps:wsp>
+                  </a:graphicData>
+                </a:graphic>
+                <wp14:sizeRelH relativeFrom="page">
+                  <wp14:pctWidth>0</wp14:pctWidth>
+                </wp14:sizeRelH>
+                <wp14:sizeRelV relativeFrom="page">
+                  <wp14:pctHeight>0</wp14:pctHeight>
+                </wp14:sizeRelV>
+              </wp:anchor>
+            </w:drawing>
+          </mc:Choice>
+          <mc:Fallback>
+            <w:pict>
+              <v:rect w14:anchorId="4B741AEB" id="_x0000_s1050" style="position:absolute;margin-left:.75pt;margin-top:3.75pt;width:461.25pt;height:84.6pt;z-index:251713536;visibility:visible;mso-wrap-style:square;mso-width-percent:0;mso-height-percent:0;mso-wrap-distance-left:9pt;mso-wrap-distance-top:0;mso-wrap-distance-right:9pt;mso-wrap-distance-bottom:0;mso-position-horizontal:absolute;mso-position-horizontal-relative:text;mso-position-vertical:absolute;mso-position-vertical-relative:text;mso-width-percent:0;mso-height-percent:0;mso-width-relative:page;mso-height-relative:page;v-text-anchor:top" o:gfxdata="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">
+                <v:textbox>
+                  <w:txbxContent>
+                    <w:p>
+                      <w:pPr>
+                        <w:rPr>
+                          <w:lang w:val="en-US"/>
+                        </w:rPr>
+                      </w:pPr>
+                      <w:r>
+                        <w:rPr>
+                          <w:lang w:val="en-US"/>
+                        </w:rPr>
+                        <w:t xml:space="preserve">1. </w:t>
+                      </w:r>
+                      <w:r>
+                        <w:rPr>
+                          <w:lang w:val="en-US"/>
+                        </w:rPr>
+                        <w:t>Add</w:t>
+                      </w:r>
+                      <w:r>
+                        <w:rPr>
+                          <w:lang w:val="en-US"/>
+                        </w:rPr>
+                        <w:t xml:space="preserve"> functionality for changing stock and deleting menu items</w:t>
+                      </w:r>
+                    </w:p>
+                  </w:txbxContent>
+                </v:textbox>
+              </v:rect>
+            </w:pict>
+          </mc:Fallback>
+        </mc:AlternateContent>
+      </w:r>
+    </w:p>
+    <w:p>
+      <w:pPr>
+        <w:rPr>
+          <w:rFonts w:ascii="Times New Roman" w:hAnsi="Times New Roman"/>
+          <w:b/>
+          <w:sz w:val="24"/>
+        </w:rPr>
+      </w:pPr>
+    </w:p>
+    <w:p>
+      <w:pPr>
+        <w:rPr>
+          <w:rFonts w:ascii="Times New Roman" w:hAnsi="Times New Roman"/>
+          <w:b/>
+          <w:sz w:val="24"/>
+        </w:rPr>
+      </w:pPr>
+    </w:p>
+    <w:p>
+      <w:pPr>
+        <w:rPr>
+          <w:rFonts w:ascii="Times New Roman" w:hAnsi="Times New Roman"/>
+          <w:b/>
+          <w:sz w:val="24"/>
+        </w:rPr>
+      </w:pPr>
+    </w:p>
+    <w:p>
+      <w:pPr>
+        <w:rPr>
+          <w:rFonts w:ascii="Times New Roman" w:hAnsi="Times New Roman"/>
+          <w:b/>
+          <w:sz w:val="24"/>
+        </w:rPr>
+      </w:pPr>
+    </w:p>
+    <w:p>
+      <w:pPr>
+        <w:rPr>
+          <w:rFonts w:ascii="Times New Roman" w:hAnsi="Times New Roman"/>
+          <w:b/>
+          <w:sz w:val="24"/>
+        </w:rPr>
+      </w:pPr>
+    </w:p>
+    <w:p>
+      <w:pPr>
+        <w:rPr>
+          <w:rFonts w:ascii="Times New Roman" w:hAnsi="Times New Roman"/>
+          <w:b/>
+          <w:sz w:val="24"/>
+        </w:rPr>
+      </w:pPr>
+    </w:p>
+    <w:p>
+      <w:pPr>
+        <w:rPr>
+          <w:rFonts w:ascii="Times New Roman" w:hAnsi="Times New Roman"/>
+          <w:b/>
+          <w:sz w:val="24"/>
+        </w:rPr>
+      </w:pPr>
+      <w:r>
+        <w:rPr>
+          <w:rFonts w:ascii="Times New Roman" w:hAnsi="Times New Roman"/>
+          <w:b/>
+          <w:sz w:val="24"/>
+        </w:rPr>
+        <w:t>Completed:</w:t>
+      </w:r>
+    </w:p>
+    <w:p>
+      <w:pPr>
+        <w:rPr>
+          <w:rFonts w:ascii="Times New Roman" w:hAnsi="Times New Roman"/>
+          <w:b/>
+          <w:sz w:val="24"/>
+        </w:rPr>
+      </w:pPr>
+      <w:r>
+        <w:rPr>
+          <w:rFonts w:ascii="Times New Roman" w:hAnsi="Times New Roman"/>
+          <w:b/>
+          <w:noProof/>
+          <w:sz w:val="24"/>
+          <w:lang w:eastAsia="en-GB" w:bidi="ne-NP"/>
+        </w:rPr>
+        <mc:AlternateContent>
+          <mc:Choice Requires="wps">
+            <w:drawing>
+              <wp:anchor distT="0" distB="0" distL="114300" distR="114300" simplePos="0" relativeHeight="251723776" behindDoc="0" locked="0" layoutInCell="1" allowOverlap="1" wp14:anchorId="44AC6AD0" wp14:editId="258A7A11">
+                <wp:simplePos x="0" y="0"/>
+                <wp:positionH relativeFrom="column">
+                  <wp:posOffset>0</wp:posOffset>
+                </wp:positionH>
+                <wp:positionV relativeFrom="paragraph">
+                  <wp:posOffset>47625</wp:posOffset>
+                </wp:positionV>
+                <wp:extent cx="5857875" cy="1074420"/>
+                <wp:effectExtent l="9525" t="5715" r="9525" b="5715"/>
+                <wp:wrapNone/>
+                <wp:docPr id="244191367" name="Rectangle 8"/>
+                <wp:cNvGraphicFramePr>
+                  <a:graphicFrameLocks xmlns:a="http://schemas.openxmlformats.org/drawingml/2006/main"/>
+                </wp:cNvGraphicFramePr>
+                <a:graphic xmlns:a="http://schemas.openxmlformats.org/drawingml/2006/main">
+                  <a:graphicData uri="http://schemas.microsoft.com/office/word/2010/wordprocessingShape">
+                    <wps:wsp>
+                      <wps:cNvSpPr>
+                        <a:spLocks noChangeArrowheads="1"/>
+                      </wps:cNvSpPr>
+                      <wps:spPr bwMode="auto">
+                        <a:xfrm>
+                          <a:off x="0" y="0"/>
+                          <a:ext cx="5857875" cy="1074420"/>
+                        </a:xfrm>
+                        <a:prstGeom prst="rect">
+                          <a:avLst/>
+                        </a:prstGeom>
+                        <a:solidFill>
+                          <a:srgbClr val="FFFFFF"/>
+                        </a:solidFill>
+                        <a:ln w="9525">
+                          <a:solidFill>
+                            <a:srgbClr val="000000"/>
+                          </a:solidFill>
+                          <a:miter lim="800000"/>
+                          <a:headEnd/>
+                          <a:tailEnd/>
+                        </a:ln>
+                      </wps:spPr>
+                      <wps:txbx>
+                        <w:txbxContent>
+                          <w:p>
+                            <w:pPr>
+                              <w:rPr>
+                                <w:lang w:val="en-US"/>
+                              </w:rPr>
+                            </w:pPr>
+                            <w:r>
+                              <w:rPr>
+                                <w:lang w:val="en-US"/>
+                              </w:rPr>
+                              <w:t xml:space="preserve">1. </w:t>
+                            </w:r>
+                            <w:r>
+                              <w:rPr>
+                                <w:lang w:val="en-US"/>
+                              </w:rPr>
+                              <w:t>Edit menu page Finished Landing page for non-logged in users</w:t>
+                            </w:r>
+                          </w:p>
+                        </w:txbxContent>
+                      </wps:txbx>
+                      <wps:bodyPr rot="0" vert="horz" wrap="square" lIns="91440" tIns="45720" rIns="91440" bIns="45720" anchor="t" anchorCtr="0" upright="1">
+                        <a:noAutofit/>
+                      </wps:bodyPr>
+                    </wps:wsp>
+                  </a:graphicData>
+                </a:graphic>
+                <wp14:sizeRelH relativeFrom="page">
+                  <wp14:pctWidth>0</wp14:pctWidth>
+                </wp14:sizeRelH>
+                <wp14:sizeRelV relativeFrom="page">
+                  <wp14:pctHeight>0</wp14:pctHeight>
+                </wp14:sizeRelV>
+              </wp:anchor>
+            </w:drawing>
+          </mc:Choice>
+          <mc:Fallback>
+            <w:pict>
+              <v:rect w14:anchorId="44AC6AD0" id="_x0000_s1051" style="position:absolute;margin-left:0;margin-top:3.75pt;width:461.25pt;height:84.6pt;z-index:251723776;visibility:visible;mso-wrap-style:square;mso-width-percent:0;mso-height-percent:0;mso-wrap-distance-left:9pt;mso-wrap-distance-top:0;mso-wrap-distance-right:9pt;mso-wrap-distance-bottom:0;mso-position-horizontal:absolute;mso-position-horizontal-relative:text;mso-position-vertical:absolute;mso-position-vertical-relative:text;mso-width-percent:0;mso-height-percent:0;mso-width-relative:page;mso-height-relative:page;v-text-anchor:top" o:gfxdata="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">
+                <v:textbox>
+                  <w:txbxContent>
+                    <w:p>
+                      <w:pPr>
+                        <w:rPr>
+                          <w:lang w:val="en-US"/>
+                        </w:rPr>
+                      </w:pPr>
+                      <w:r>
+                        <w:rPr>
+                          <w:lang w:val="en-US"/>
+                        </w:rPr>
+                        <w:t xml:space="preserve">1. </w:t>
+                      </w:r>
+                      <w:r>
+                        <w:rPr>
+                          <w:lang w:val="en-US"/>
+                        </w:rPr>
+                        <w:t>Edit menu page Finished Landing page for non-logged in users</w:t>
+                      </w:r>
+                    </w:p>
+                  </w:txbxContent>
+                </v:textbox>
+              </v:rect>
+            </w:pict>
+          </mc:Fallback>
+        </mc:AlternateContent>
+      </w:r>
+    </w:p>
+    <w:p>
+      <w:pPr>
+        <w:rPr>
+          <w:rFonts w:ascii="Times New Roman" w:hAnsi="Times New Roman"/>
+          <w:b/>
+          <w:sz w:val="24"/>
+        </w:rPr>
+      </w:pPr>
+    </w:p>
+    <w:p>
+      <w:pPr>
+        <w:rPr>
+          <w:rFonts w:ascii="Times New Roman" w:hAnsi="Times New Roman"/>
+          <w:b/>
+          <w:sz w:val="24"/>
+        </w:rPr>
+      </w:pPr>
+    </w:p>
+    <w:p>
+      <w:pPr>
+        <w:rPr>
+          <w:rFonts w:ascii="Times New Roman" w:hAnsi="Times New Roman"/>
+          <w:b/>
+          <w:sz w:val="24"/>
+        </w:rPr>
+      </w:pPr>
+      <w:r>
+        <w:rPr>
+          <w:rFonts w:ascii="Times New Roman" w:hAnsi="Times New Roman"/>
+          <w:b/>
+          <w:sz w:val="24"/>
+        </w:rPr>
+        <w:t>Observations</w:t>
+      </w:r>
+      <w:r>
+        <w:rPr>
+          <w:rFonts w:ascii="Times New Roman" w:hAnsi="Times New Roman"/>
+          <w:b/>
+          <w:sz w:val="24"/>
+        </w:rPr>
+        <w:t>:</w:t>
+      </w:r>
+    </w:p>
+    <w:p>
+      <w:pPr>
+        <w:rPr>
+          <w:rFonts w:ascii="Times New Roman" w:hAnsi="Times New Roman"/>
+          <w:b/>
+          <w:sz w:val="24"/>
+        </w:rPr>
+      </w:pPr>
+    </w:p>
+    <w:p>
+      <w:pPr>
+        <w:rPr>
+          <w:rFonts w:ascii="Times New Roman" w:hAnsi="Times New Roman"/>
+          <w:b/>
+          <w:sz w:val="24"/>
+        </w:rPr>
+      </w:pPr>
+    </w:p>
+    <w:p>
+      <w:pPr>
+        <w:rPr>
+          <w:rFonts w:ascii="Times New Roman" w:hAnsi="Times New Roman"/>
+          <w:b/>
+          <w:sz w:val="24"/>
+        </w:rPr>
+      </w:pPr>
+    </w:p>
+    <w:p>
+      <w:pPr>
+        <w:rPr>
+          <w:rFonts w:ascii="Times New Roman" w:hAnsi="Times New Roman"/>
+          <w:b/>
+          <w:sz w:val="24"/>
+        </w:rPr>
+      </w:pPr>
+      <w:r>
+        <w:rPr>
+          <w:rFonts w:ascii="Times New Roman" w:hAnsi="Times New Roman"/>
+          <w:b/>
+          <w:sz w:val="24"/>
+        </w:rPr>
+        <w:t xml:space="preserve">Name: </w:t>
+      </w:r>
+      <w:proofErr w:type="spellStart"/>
+      <w:r>
+        <w:rPr>
+          <w:rFonts w:ascii="Times New Roman" w:hAnsi="Times New Roman"/>
+          <w:b/>
+          <w:sz w:val="24"/>
+        </w:rPr>
+        <w:t>Saistha</w:t>
+      </w:r>
+      <w:proofErr w:type="spellEnd"/>
+      <w:r>
+        <w:rPr>
+          <w:rFonts w:ascii="Times New Roman" w:hAnsi="Times New Roman"/>
+          <w:b/>
+          <w:sz w:val="24"/>
+        </w:rPr>
+        <w:t xml:space="preserve"> Pradhan</w:t>
+      </w:r>
+    </w:p>
+    <w:p>
+      <w:pPr>
+        <w:rPr>
+          <w:rFonts w:ascii="Times New Roman" w:hAnsi="Times New Roman"/>
+          <w:b/>
+          <w:sz w:val="24"/>
+        </w:rPr>
+      </w:pPr>
+      <w:r>
+        <w:rPr>
+          <w:rFonts w:ascii="Times New Roman" w:hAnsi="Times New Roman"/>
+          <w:b/>
+          <w:sz w:val="24"/>
+        </w:rPr>
+        <w:t xml:space="preserve">In progress: </w:t>
+      </w:r>
+    </w:p>
+    <w:p>
+      <w:pPr>
+        <w:rPr>
+          <w:rFonts w:ascii="Times New Roman" w:hAnsi="Times New Roman"/>
+          <w:b/>
+          <w:sz w:val="24"/>
+        </w:rPr>
+      </w:pPr>
+      <w:r>
+        <w:rPr>
+          <w:rFonts w:ascii="Times New Roman" w:hAnsi="Times New Roman"/>
+          <w:b/>
+          <w:noProof/>
+          <w:sz w:val="24"/>
+          <w:lang w:eastAsia="en-GB" w:bidi="ne-NP"/>
+        </w:rPr>
+        <mc:AlternateContent>
+          <mc:Choice Requires="wps">
+            <w:drawing>
+              <wp:anchor distT="0" distB="0" distL="114300" distR="114300" simplePos="0" relativeHeight="251725824" behindDoc="0" locked="0" layoutInCell="1" allowOverlap="1" wp14:anchorId="691FF86D" wp14:editId="0A8A53E1">
+                <wp:simplePos x="0" y="0"/>
+                <wp:positionH relativeFrom="column">
+                  <wp:posOffset>9525</wp:posOffset>
+                </wp:positionH>
+                <wp:positionV relativeFrom="paragraph">
+                  <wp:posOffset>47625</wp:posOffset>
+                </wp:positionV>
+                <wp:extent cx="5857875" cy="1074420"/>
+                <wp:effectExtent l="9525" t="5715" r="9525" b="5715"/>
+                <wp:wrapNone/>
+                <wp:docPr id="656058591" name="Rectangle 8"/>
+                <wp:cNvGraphicFramePr>
+                  <a:graphicFrameLocks xmlns:a="http://schemas.openxmlformats.org/drawingml/2006/main"/>
+                </wp:cNvGraphicFramePr>
+                <a:graphic xmlns:a="http://schemas.openxmlformats.org/drawingml/2006/main">
+                  <a:graphicData uri="http://schemas.microsoft.com/office/word/2010/wordprocessingShape">
+                    <wps:wsp>
+                      <wps:cNvSpPr>
+                        <a:spLocks noChangeArrowheads="1"/>
+                      </wps:cNvSpPr>
+                      <wps:spPr bwMode="auto">
+                        <a:xfrm>
+                          <a:off x="0" y="0"/>
+                          <a:ext cx="5857875" cy="1074420"/>
+                        </a:xfrm>
+                        <a:prstGeom prst="rect">
+                          <a:avLst/>
+                        </a:prstGeom>
+                        <a:solidFill>
+                          <a:srgbClr val="FFFFFF"/>
+                        </a:solidFill>
+                        <a:ln w="9525">
+                          <a:solidFill>
+                            <a:srgbClr val="000000"/>
+                          </a:solidFill>
+                          <a:miter lim="800000"/>
+                          <a:headEnd/>
+                          <a:tailEnd/>
+                        </a:ln>
+                      </wps:spPr>
+                      <wps:txbx>
+                        <w:txbxContent>
+                          <w:p>
+                            <w:pPr>
+                              <w:rPr>
+                                <w:lang w:val="en-US"/>
+                              </w:rPr>
+                            </w:pPr>
+                            <w:r>
+                              <w:rPr>
+                                <w:lang w:val="en-US"/>
+                              </w:rPr>
+                              <w:t>-</w:t>
+                            </w:r>
+                          </w:p>
+                        </w:txbxContent>
+                      </wps:txbx>
+                      <wps:bodyPr rot="0" vert="horz" wrap="square" lIns="91440" tIns="45720" rIns="91440" bIns="45720" anchor="t" anchorCtr="0" upright="1">
+                        <a:noAutofit/>
+                      </wps:bodyPr>
+                    </wps:wsp>
+                  </a:graphicData>
+                </a:graphic>
+                <wp14:sizeRelH relativeFrom="page">
+                  <wp14:pctWidth>0</wp14:pctWidth>
+                </wp14:sizeRelH>
+                <wp14:sizeRelV relativeFrom="page">
+                  <wp14:pctHeight>0</wp14:pctHeight>
+                </wp14:sizeRelV>
+              </wp:anchor>
+            </w:drawing>
+          </mc:Choice>
+          <mc:Fallback>
+            <w:pict>
+              <v:rect w14:anchorId="691FF86D" id="_x0000_s1052" style="position:absolute;margin-left:.75pt;margin-top:3.75pt;width:461.25pt;height:84.6pt;z-index:251725824;visibility:visible;mso-wrap-style:square;mso-width-percent:0;mso-height-percent:0;mso-wrap-distance-left:9pt;mso-wrap-distance-top:0;mso-wrap-distance-right:9pt;mso-wrap-distance-bottom:0;mso-position-horizontal:absolute;mso-position-horizontal-relative:text;mso-position-vertical:absolute;mso-position-vertical-relative:text;mso-width-percent:0;mso-height-percent:0;mso-width-relative:page;mso-height-relative:page;v-text-anchor:top" o:gfxdata="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">
+                <v:textbox>
+                  <w:txbxContent>
+                    <w:p>
+                      <w:pPr>
+                        <w:rPr>
+                          <w:lang w:val="en-US"/>
+                        </w:rPr>
+                      </w:pPr>
+                      <w:r>
+                        <w:rPr>
+                          <w:lang w:val="en-US"/>
+                        </w:rPr>
+                        <w:t>-</w:t>
+                      </w:r>
+                    </w:p>
+                  </w:txbxContent>
+                </v:textbox>
+              </v:rect>
+            </w:pict>
+          </mc:Fallback>
+        </mc:AlternateContent>
+      </w:r>
+    </w:p>
+    <w:p>
+      <w:pPr>
+        <w:rPr>
+          <w:rFonts w:ascii="Times New Roman" w:hAnsi="Times New Roman"/>
+          <w:b/>
+          <w:sz w:val="24"/>
+        </w:rPr>
+      </w:pPr>
+    </w:p>
+    <w:p>
+      <w:pPr>
+        <w:rPr>
+          <w:rFonts w:ascii="Times New Roman" w:hAnsi="Times New Roman"/>
+          <w:b/>
+          <w:sz w:val="24"/>
+        </w:rPr>
+      </w:pPr>
+    </w:p>
+    <w:p>
+      <w:pPr>
+        <w:rPr>
+          <w:rFonts w:ascii="Times New Roman" w:hAnsi="Times New Roman"/>
+          <w:b/>
+          <w:sz w:val="24"/>
+        </w:rPr>
+      </w:pPr>
+    </w:p>
+    <w:p>
+      <w:pPr>
+        <w:rPr>
+          <w:rFonts w:ascii="Times New Roman" w:hAnsi="Times New Roman"/>
+          <w:b/>
+          <w:sz w:val="24"/>
+        </w:rPr>
+      </w:pPr>
+    </w:p>
+    <w:p>
+      <w:pPr>
+        <w:rPr>
+          <w:rFonts w:ascii="Times New Roman" w:hAnsi="Times New Roman"/>
+          <w:b/>
+          <w:sz w:val="24"/>
+        </w:rPr>
+      </w:pPr>
+    </w:p>
+    <w:p>
+      <w:pPr>
+        <w:rPr>
+          <w:rFonts w:ascii="Times New Roman" w:hAnsi="Times New Roman"/>
+          <w:b/>
+          <w:sz w:val="24"/>
+        </w:rPr>
+      </w:pPr>
+    </w:p>
+    <w:p>
+      <w:pPr>
+        <w:rPr>
+          <w:rFonts w:ascii="Times New Roman" w:hAnsi="Times New Roman"/>
+          <w:b/>
+          <w:sz w:val="24"/>
+        </w:rPr>
+      </w:pPr>
+      <w:r>
+        <w:rPr>
+          <w:rFonts w:ascii="Times New Roman" w:hAnsi="Times New Roman"/>
+          <w:b/>
+          <w:sz w:val="24"/>
+        </w:rPr>
+        <w:t>Completed:</w:t>
+      </w:r>
+    </w:p>
+    <w:p>
+      <w:pPr>
+        <w:rPr>
+          <w:rFonts w:ascii="Times New Roman" w:hAnsi="Times New Roman"/>
+          <w:b/>
+          <w:sz w:val="24"/>
+        </w:rPr>
+      </w:pPr>
+      <w:r>
+        <w:rPr>
+          <w:rFonts w:ascii="Times New Roman" w:hAnsi="Times New Roman"/>
+          <w:b/>
+          <w:noProof/>
+          <w:sz w:val="24"/>
+          <w:lang w:eastAsia="en-GB" w:bidi="ne-NP"/>
+        </w:rPr>
+        <mc:AlternateContent>
+          <mc:Choice Requires="wps">
+            <w:drawing>
+              <wp:anchor distT="0" distB="0" distL="114300" distR="114300" simplePos="0" relativeHeight="251726848" behindDoc="0" locked="0" layoutInCell="1" allowOverlap="1" wp14:anchorId="77C08FE3" wp14:editId="315CFDAA">
+                <wp:simplePos x="0" y="0"/>
+                <wp:positionH relativeFrom="column">
+                  <wp:posOffset>0</wp:posOffset>
+                </wp:positionH>
+                <wp:positionV relativeFrom="paragraph">
+                  <wp:posOffset>47625</wp:posOffset>
+                </wp:positionV>
+                <wp:extent cx="5857875" cy="1074420"/>
+                <wp:effectExtent l="9525" t="5715" r="9525" b="5715"/>
+                <wp:wrapNone/>
+                <wp:docPr id="1475263400" name="Rectangle 8"/>
+                <wp:cNvGraphicFramePr>
+                  <a:graphicFrameLocks xmlns:a="http://schemas.openxmlformats.org/drawingml/2006/main"/>
+                </wp:cNvGraphicFramePr>
+                <a:graphic xmlns:a="http://schemas.openxmlformats.org/drawingml/2006/main">
+                  <a:graphicData uri="http://schemas.microsoft.com/office/word/2010/wordprocessingShape">
+                    <wps:wsp>
+                      <wps:cNvSpPr>
+                        <a:spLocks noChangeArrowheads="1"/>
+                      </wps:cNvSpPr>
+                      <wps:spPr bwMode="auto">
+                        <a:xfrm>
+                          <a:off x="0" y="0"/>
+                          <a:ext cx="5857875" cy="1074420"/>
+                        </a:xfrm>
+                        <a:prstGeom prst="rect">
+                          <a:avLst/>
+                        </a:prstGeom>
+                        <a:solidFill>
+                          <a:srgbClr val="FFFFFF"/>
+                        </a:solidFill>
+                        <a:ln w="9525">
+                          <a:solidFill>
+                            <a:srgbClr val="000000"/>
+                          </a:solidFill>
+                          <a:miter lim="800000"/>
+                          <a:headEnd/>
+                          <a:tailEnd/>
+                        </a:ln>
+                      </wps:spPr>
+                      <wps:txbx>
+                        <w:txbxContent>
+                          <w:p>
+                            <w:pPr>
+                              <w:pStyle w:val="ListParagraph"/>
+                              <w:numPr>
+                                <w:ilvl w:val="0"/>
+                                <w:numId w:val="14"/>
+                              </w:numPr>
+                              <w:rPr>
+                                <w:lang w:val="en-US"/>
+                              </w:rPr>
+                            </w:pPr>
+                            <w:r>
+                              <w:rPr>
+                                <w:lang w:val="en-US"/>
+                              </w:rPr>
+                              <w:t>Add menu page to let admin add menu items in the menu page</w:t>
+                            </w:r>
+                          </w:p>
+                        </w:txbxContent>
+                      </wps:txbx>
+                      <wps:bodyPr rot="0" vert="horz" wrap="square" lIns="91440" tIns="45720" rIns="91440" bIns="45720" anchor="t" anchorCtr="0" upright="1">
+                        <a:noAutofit/>
+                      </wps:bodyPr>
+                    </wps:wsp>
+                  </a:graphicData>
+                </a:graphic>
+                <wp14:sizeRelH relativeFrom="page">
+                  <wp14:pctWidth>0</wp14:pctWidth>
+                </wp14:sizeRelH>
+                <wp14:sizeRelV relativeFrom="page">
+                  <wp14:pctHeight>0</wp14:pctHeight>
+                </wp14:sizeRelV>
+              </wp:anchor>
+            </w:drawing>
+          </mc:Choice>
+          <mc:Fallback>
+            <w:pict>
+              <v:rect w14:anchorId="77C08FE3" id="_x0000_s1053" style="position:absolute;margin-left:0;margin-top:3.75pt;width:461.25pt;height:84.6pt;z-index:251726848;visibility:visible;mso-wrap-style:square;mso-width-percent:0;mso-height-percent:0;mso-wrap-distance-left:9pt;mso-wrap-distance-top:0;mso-wrap-distance-right:9pt;mso-wrap-distance-bottom:0;mso-position-horizontal:absolute;mso-position-horizontal-relative:text;mso-position-vertical:absolute;mso-position-vertical-relative:text;mso-width-percent:0;mso-height-percent:0;mso-width-relative:page;mso-height-relative:page;v-text-anchor:top" o:gfxdata="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">
+                <v:textbox>
+                  <w:txbxContent>
+                    <w:p>
+                      <w:pPr>
+                        <w:pStyle w:val="ListParagraph"/>
+                        <w:numPr>
+                          <w:ilvl w:val="0"/>
+                          <w:numId w:val="14"/>
+                        </w:numPr>
+                        <w:rPr>
+                          <w:lang w:val="en-US"/>
+                        </w:rPr>
+                      </w:pPr>
+                      <w:r>
+                        <w:rPr>
+                          <w:lang w:val="en-US"/>
+                        </w:rPr>
+                        <w:t>Add menu page to let admin add menu items in the menu page</w:t>
+                      </w:r>
+                    </w:p>
+                  </w:txbxContent>
+                </v:textbox>
+              </v:rect>
+            </w:pict>
+          </mc:Fallback>
+        </mc:AlternateContent>
+      </w:r>
+    </w:p>
+    <w:p>
+      <w:pPr>
+        <w:rPr>
+          <w:rFonts w:ascii="Times New Roman" w:hAnsi="Times New Roman"/>
+          <w:b/>
+          <w:sz w:val="24"/>
+        </w:rPr>
+      </w:pPr>
+    </w:p>
+    <w:p>
+      <w:pPr>
+        <w:rPr>
+          <w:rFonts w:ascii="Times New Roman" w:hAnsi="Times New Roman"/>
+          <w:b/>
+          <w:sz w:val="24"/>
+        </w:rPr>
+      </w:pPr>
+    </w:p>
+    <w:p>
+      <w:pPr>
+        <w:rPr>
+          <w:rFonts w:ascii="Times New Roman" w:hAnsi="Times New Roman"/>
+          <w:b/>
+          <w:sz w:val="24"/>
+        </w:rPr>
+      </w:pPr>
+      <w:r>
+        <w:rPr>
+          <w:rFonts w:ascii="Times New Roman" w:hAnsi="Times New Roman"/>
+          <w:b/>
+          <w:sz w:val="24"/>
+        </w:rPr>
+        <w:t>Observations</w:t>
+      </w:r>
+      <w:r>
+        <w:rPr>
+          <w:rFonts w:ascii="Times New Roman" w:hAnsi="Times New Roman"/>
+          <w:b/>
+          <w:sz w:val="24"/>
+        </w:rPr>
+        <w:t>:</w:t>
+      </w:r>
+    </w:p>
+    <w:p>
+      <w:pPr>
+        <w:rPr>
+          <w:rFonts w:ascii="Times New Roman" w:hAnsi="Times New Roman"/>
+          <w:b/>
+          <w:sz w:val="24"/>
+        </w:rPr>
+      </w:pPr>
+    </w:p>
+    <w:p>
+      <w:pPr>
+        <w:rPr>
+          <w:rFonts w:ascii="Times New Roman" w:hAnsi="Times New Roman"/>
+          <w:b/>
+          <w:sz w:val="24"/>
+        </w:rPr>
+      </w:pPr>
+    </w:p>
+    <w:p>
+      <w:pPr>
+        <w:rPr>
+          <w:rFonts w:ascii="Times New Roman" w:hAnsi="Times New Roman"/>
+          <w:b/>
+          <w:sz w:val="24"/>
+        </w:rPr>
+      </w:pPr>
+    </w:p>
+    <w:p>
+      <w:pPr>
+        <w:rPr>
+          <w:rFonts w:ascii="Times New Roman" w:hAnsi="Times New Roman"/>
+          <w:b/>
+          <w:sz w:val="24"/>
+        </w:rPr>
+      </w:pPr>
+      <w:r>
+        <w:rPr>
+          <w:rFonts w:ascii="Times New Roman" w:hAnsi="Times New Roman"/>
+          <w:b/>
+          <w:sz w:val="24"/>
+        </w:rPr>
+        <w:t>Name: Aishwarya Prashant</w:t>
+      </w:r>
+    </w:p>
+    <w:p>
+      <w:pPr>
+        <w:rPr>
+          <w:rFonts w:ascii="Times New Roman" w:hAnsi="Times New Roman"/>
+          <w:b/>
+          <w:sz w:val="24"/>
+        </w:rPr>
+      </w:pPr>
+      <w:r>
+        <w:rPr>
+          <w:rFonts w:ascii="Times New Roman" w:hAnsi="Times New Roman"/>
+          <w:b/>
+          <w:sz w:val="24"/>
+        </w:rPr>
+        <w:t xml:space="preserve">In progress: </w:t>
+      </w:r>
+    </w:p>
+    <w:p>
+      <w:pPr>
+        <w:rPr>
+          <w:rFonts w:ascii="Times New Roman" w:hAnsi="Times New Roman"/>
+          <w:b/>
+          <w:sz w:val="24"/>
+        </w:rPr>
+      </w:pPr>
+      <w:r>
+        <w:rPr>
+          <w:rFonts w:ascii="Times New Roman" w:hAnsi="Times New Roman"/>
+          <w:b/>
+          <w:noProof/>
+          <w:sz w:val="24"/>
+          <w:lang w:eastAsia="en-GB" w:bidi="ne-NP"/>
+        </w:rPr>
+        <mc:AlternateContent>
+          <mc:Choice Requires="wps">
+            <w:drawing>
+              <wp:anchor distT="0" distB="0" distL="114300" distR="114300" simplePos="0" relativeHeight="251728896" behindDoc="0" locked="0" layoutInCell="1" allowOverlap="1" wp14:anchorId="24E961E8" wp14:editId="285DCD1C">
+                <wp:simplePos x="0" y="0"/>
+                <wp:positionH relativeFrom="column">
+                  <wp:posOffset>9525</wp:posOffset>
+                </wp:positionH>
+                <wp:positionV relativeFrom="paragraph">
+                  <wp:posOffset>47625</wp:posOffset>
+                </wp:positionV>
+                <wp:extent cx="5857875" cy="1074420"/>
+                <wp:effectExtent l="9525" t="5715" r="9525" b="5715"/>
+                <wp:wrapNone/>
+                <wp:docPr id="738351722" name="Rectangle 8"/>
+                <wp:cNvGraphicFramePr>
+                  <a:graphicFrameLocks xmlns:a="http://schemas.openxmlformats.org/drawingml/2006/main"/>
+                </wp:cNvGraphicFramePr>
+                <a:graphic xmlns:a="http://schemas.openxmlformats.org/drawingml/2006/main">
+                  <a:graphicData uri="http://schemas.microsoft.com/office/word/2010/wordprocessingShape">
+                    <wps:wsp>
+                      <wps:cNvSpPr>
+                        <a:spLocks noChangeArrowheads="1"/>
+                      </wps:cNvSpPr>
+                      <wps:spPr bwMode="auto">
+                        <a:xfrm>
+                          <a:off x="0" y="0"/>
+                          <a:ext cx="5857875" cy="1074420"/>
+                        </a:xfrm>
+                        <a:prstGeom prst="rect">
+                          <a:avLst/>
+                        </a:prstGeom>
+                        <a:solidFill>
+                          <a:srgbClr val="FFFFFF"/>
+                        </a:solidFill>
+                        <a:ln w="9525">
+                          <a:solidFill>
+                            <a:srgbClr val="000000"/>
+                          </a:solidFill>
+                          <a:miter lim="800000"/>
+                          <a:headEnd/>
+                          <a:tailEnd/>
+                        </a:ln>
+                      </wps:spPr>
+                      <wps:txbx>
+                        <w:txbxContent>
+                          <w:p>
+                            <w:pPr>
+                              <w:pStyle w:val="ListParagraph"/>
+                              <w:numPr>
+                                <w:ilvl w:val="0"/>
+                                <w:numId w:val="15"/>
+                              </w:numPr>
+                              <w:rPr>
+                                <w:lang w:val="en-US"/>
+                              </w:rPr>
+                            </w:pPr>
+                            <w:r>
+                              <w:rPr>
+                                <w:lang w:val="en-US"/>
+                              </w:rPr>
+                              <w:t>Making manage users page functional and work</w:t>
+                            </w:r>
+                          </w:p>
+                        </w:txbxContent>
+                      </wps:txbx>
+                      <wps:bodyPr rot="0" vert="horz" wrap="square" lIns="91440" tIns="45720" rIns="91440" bIns="45720" anchor="t" anchorCtr="0" upright="1">
+                        <a:noAutofit/>
+                      </wps:bodyPr>
+                    </wps:wsp>
+                  </a:graphicData>
+                </a:graphic>
+                <wp14:sizeRelH relativeFrom="page">
+                  <wp14:pctWidth>0</wp14:pctWidth>
+                </wp14:sizeRelH>
+                <wp14:sizeRelV relativeFrom="page">
+                  <wp14:pctHeight>0</wp14:pctHeight>
+                </wp14:sizeRelV>
+              </wp:anchor>
+            </w:drawing>
+          </mc:Choice>
+          <mc:Fallback>
+            <w:pict>
+              <v:rect w14:anchorId="24E961E8" id="_x0000_s1054" style="position:absolute;margin-left:.75pt;margin-top:3.75pt;width:461.25pt;height:84.6pt;z-index:251728896;visibility:visible;mso-wrap-style:square;mso-width-percent:0;mso-height-percent:0;mso-wrap-distance-left:9pt;mso-wrap-distance-top:0;mso-wrap-distance-right:9pt;mso-wrap-distance-bottom:0;mso-position-horizontal:absolute;mso-position-horizontal-relative:text;mso-position-vertical:absolute;mso-position-vertical-relative:text;mso-width-percent:0;mso-height-percent:0;mso-width-relative:page;mso-height-relative:page;v-text-anchor:top" o:gfxdata="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">
+                <v:textbox>
+                  <w:txbxContent>
+                    <w:p>
+                      <w:pPr>
+                        <w:pStyle w:val="ListParagraph"/>
+                        <w:numPr>
+                          <w:ilvl w:val="0"/>
+                          <w:numId w:val="15"/>
+                        </w:numPr>
+                        <w:rPr>
+                          <w:lang w:val="en-US"/>
+                        </w:rPr>
+                      </w:pPr>
+                      <w:r>
+                        <w:rPr>
+                          <w:lang w:val="en-US"/>
+                        </w:rPr>
+                        <w:t>Making manage users page functional and work</w:t>
+                      </w:r>
+                    </w:p>
+                  </w:txbxContent>
+                </v:textbox>
+              </v:rect>
+            </w:pict>
+          </mc:Fallback>
+        </mc:AlternateContent>
+      </w:r>
+    </w:p>
+    <w:p>
+      <w:pPr>
+        <w:rPr>
+          <w:rFonts w:ascii="Times New Roman" w:hAnsi="Times New Roman"/>
+          <w:b/>
+          <w:sz w:val="24"/>
+        </w:rPr>
+      </w:pPr>
+    </w:p>
+    <w:p>
+      <w:pPr>
+        <w:rPr>
+          <w:rFonts w:ascii="Times New Roman" w:hAnsi="Times New Roman"/>
+          <w:b/>
+          <w:sz w:val="24"/>
+        </w:rPr>
+      </w:pPr>
+    </w:p>
+    <w:p>
+      <w:pPr>
+        <w:rPr>
+          <w:rFonts w:ascii="Times New Roman" w:hAnsi="Times New Roman"/>
+          <w:b/>
+          <w:sz w:val="24"/>
+        </w:rPr>
+      </w:pPr>
+    </w:p>
+    <w:p>
+      <w:pPr>
+        <w:rPr>
+          <w:rFonts w:ascii="Times New Roman" w:hAnsi="Times New Roman"/>
+          <w:b/>
+          <w:sz w:val="24"/>
+        </w:rPr>
+      </w:pPr>
+    </w:p>
+    <w:p>
+      <w:pPr>
+        <w:rPr>
+          <w:rFonts w:ascii="Times New Roman" w:hAnsi="Times New Roman"/>
+          <w:b/>
+          <w:sz w:val="24"/>
+        </w:rPr>
+      </w:pPr>
+    </w:p>
+    <w:p>
+      <w:pPr>
+        <w:rPr>
+          <w:rFonts w:ascii="Times New Roman" w:hAnsi="Times New Roman"/>
+          <w:b/>
+          <w:sz w:val="24"/>
+        </w:rPr>
+      </w:pPr>
+    </w:p>
+    <w:p>
+      <w:pPr>
+        <w:rPr>
+          <w:rFonts w:ascii="Times New Roman" w:hAnsi="Times New Roman"/>
+          <w:b/>
+          <w:sz w:val="24"/>
+        </w:rPr>
+      </w:pPr>
+      <w:r>
+        <w:rPr>
+          <w:rFonts w:ascii="Times New Roman" w:hAnsi="Times New Roman"/>
+          <w:b/>
+          <w:sz w:val="24"/>
+        </w:rPr>
+        <w:t>Completed:</w:t>
+      </w:r>
+    </w:p>
+    <w:p>
+      <w:pPr>
+        <w:rPr>
+          <w:rFonts w:ascii="Times New Roman" w:hAnsi="Times New Roman"/>
+          <w:b/>
+          <w:sz w:val="24"/>
+        </w:rPr>
+      </w:pPr>
+      <w:r>
+        <w:rPr>
+          <w:rFonts w:ascii="Times New Roman" w:hAnsi="Times New Roman"/>
+          <w:b/>
+          <w:noProof/>
+          <w:sz w:val="24"/>
+          <w:lang w:eastAsia="en-GB" w:bidi="ne-NP"/>
+        </w:rPr>
+        <mc:AlternateContent>
+          <mc:Choice Requires="wps">
+            <w:drawing>
+              <wp:anchor distT="0" distB="0" distL="114300" distR="114300" simplePos="0" relativeHeight="251729920" behindDoc="0" locked="0" layoutInCell="1" allowOverlap="1" wp14:anchorId="31927E1E" wp14:editId="5BFD21A9">
+                <wp:simplePos x="0" y="0"/>
+                <wp:positionH relativeFrom="column">
+                  <wp:posOffset>0</wp:posOffset>
+                </wp:positionH>
+                <wp:positionV relativeFrom="paragraph">
+                  <wp:posOffset>47625</wp:posOffset>
+                </wp:positionV>
+                <wp:extent cx="5857875" cy="1074420"/>
+                <wp:effectExtent l="9525" t="5715" r="9525" b="5715"/>
+                <wp:wrapNone/>
+                <wp:docPr id="1764817396" name="Rectangle 8"/>
+                <wp:cNvGraphicFramePr>
+                  <a:graphicFrameLocks xmlns:a="http://schemas.openxmlformats.org/drawingml/2006/main"/>
+                </wp:cNvGraphicFramePr>
+                <a:graphic xmlns:a="http://schemas.openxmlformats.org/drawingml/2006/main">
+                  <a:graphicData uri="http://schemas.microsoft.com/office/word/2010/wordprocessingShape">
+                    <wps:wsp>
+                      <wps:cNvSpPr>
+                        <a:spLocks noChangeArrowheads="1"/>
+                      </wps:cNvSpPr>
+                      <wps:spPr bwMode="auto">
+                        <a:xfrm>
+                          <a:off x="0" y="0"/>
+                          <a:ext cx="5857875" cy="1074420"/>
+                        </a:xfrm>
+                        <a:prstGeom prst="rect">
+                          <a:avLst/>
+                        </a:prstGeom>
+                        <a:solidFill>
+                          <a:srgbClr val="FFFFFF"/>
+                        </a:solidFill>
+                        <a:ln w="9525">
+                          <a:solidFill>
+                            <a:srgbClr val="000000"/>
+                          </a:solidFill>
+                          <a:miter lim="800000"/>
+                          <a:headEnd/>
+                          <a:tailEnd/>
+                        </a:ln>
+                      </wps:spPr>
+                      <wps:txbx>
+                        <w:txbxContent>
+                          <w:p>
+                            <w:pPr>
+                              <w:pStyle w:val="ListParagraph"/>
+                              <w:numPr>
+                                <w:ilvl w:val="0"/>
+                                <w:numId w:val="14"/>
+                              </w:numPr>
+                              <w:rPr>
+                                <w:lang w:val="en-US"/>
+                              </w:rPr>
+                            </w:pPr>
+                            <w:r>
+                              <w:rPr>
+                                <w:lang w:val="en-US"/>
+                              </w:rPr>
+                              <w:t>Manage users page structure</w:t>
+                            </w:r>
+                          </w:p>
+                        </w:txbxContent>
+                      </wps:txbx>
+                      <wps:bodyPr rot="0" vert="horz" wrap="square" lIns="91440" tIns="45720" rIns="91440" bIns="45720" anchor="t" anchorCtr="0" upright="1">
+                        <a:noAutofit/>
+                      </wps:bodyPr>
+                    </wps:wsp>
+                  </a:graphicData>
+                </a:graphic>
+                <wp14:sizeRelH relativeFrom="page">
+                  <wp14:pctWidth>0</wp14:pctWidth>
+                </wp14:sizeRelH>
+                <wp14:sizeRelV relativeFrom="page">
+                  <wp14:pctHeight>0</wp14:pctHeight>
+                </wp14:sizeRelV>
+              </wp:anchor>
+            </w:drawing>
+          </mc:Choice>
+          <mc:Fallback>
+            <w:pict>
+              <v:rect w14:anchorId="31927E1E" id="_x0000_s1055" style="position:absolute;margin-left:0;margin-top:3.75pt;width:461.25pt;height:84.6pt;z-index:251729920;visibility:visible;mso-wrap-style:square;mso-width-percent:0;mso-height-percent:0;mso-wrap-distance-left:9pt;mso-wrap-distance-top:0;mso-wrap-distance-right:9pt;mso-wrap-distance-bottom:0;mso-position-horizontal:absolute;mso-position-horizontal-relative:text;mso-position-vertical:absolute;mso-position-vertical-relative:text;mso-width-percent:0;mso-height-percent:0;mso-width-relative:page;mso-height-relative:page;v-text-anchor:top" o:gfxdata="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">
+                <v:textbox>
+                  <w:txbxContent>
+                    <w:p>
+                      <w:pPr>
+                        <w:pStyle w:val="ListParagraph"/>
+                        <w:numPr>
+                          <w:ilvl w:val="0"/>
+                          <w:numId w:val="14"/>
+                        </w:numPr>
+                        <w:rPr>
+                          <w:lang w:val="en-US"/>
+                        </w:rPr>
+                      </w:pPr>
+                      <w:r>
+                        <w:rPr>
+                          <w:lang w:val="en-US"/>
+                        </w:rPr>
+                        <w:t>Manage users page structure</w:t>
+                      </w:r>
+                    </w:p>
+                  </w:txbxContent>
+                </v:textbox>
+              </v:rect>
+            </w:pict>
+          </mc:Fallback>
+        </mc:AlternateContent>
+      </w:r>
+    </w:p>
+    <w:p>
+      <w:pPr>
+        <w:rPr>
+          <w:rFonts w:ascii="Times New Roman" w:hAnsi="Times New Roman"/>
+          <w:b/>
+          <w:sz w:val="24"/>
+        </w:rPr>
+      </w:pPr>
+    </w:p>
+    <w:p>
+      <w:pPr>
+        <w:rPr>
+          <w:rFonts w:ascii="Times New Roman" w:hAnsi="Times New Roman"/>
+          <w:b/>
+          <w:sz w:val="24"/>
+        </w:rPr>
+      </w:pPr>
+    </w:p>
+    <w:p>
+      <w:pPr>
+        <w:rPr>
+          <w:rFonts w:ascii="Times New Roman" w:hAnsi="Times New Roman"/>
+          <w:b/>
+          <w:sz w:val="24"/>
+        </w:rPr>
+      </w:pPr>
+      <w:r>
+        <w:rPr>
+          <w:rFonts w:ascii="Times New Roman" w:hAnsi="Times New Roman"/>
+          <w:b/>
+          <w:sz w:val="24"/>
+        </w:rPr>
+        <w:t>Observations</w:t>
+      </w:r>
+      <w:r>
+        <w:rPr>
+          <w:rFonts w:ascii="Times New Roman" w:hAnsi="Times New Roman"/>
+          <w:b/>
+          <w:sz w:val="24"/>
+        </w:rPr>
+        <w:t>:</w:t>
+      </w:r>
+    </w:p>
+    <w:p>
+      <w:pPr>
+        <w:rPr>
+          <w:rFonts w:ascii="Times New Roman" w:hAnsi="Times New Roman"/>
+          <w:b/>
+          <w:sz w:val="24"/>
+        </w:rPr>
+      </w:pPr>
+    </w:p>
+    <w:p>
+      <w:pPr>
+        <w:rPr>
+          <w:rFonts w:ascii="Times New Roman" w:hAnsi="Times New Roman"/>
+          <w:b/>
+          <w:sz w:val="24"/>
+        </w:rPr>
+      </w:pPr>
+      <w:r>
+        <w:rPr>
+          <w:rFonts w:ascii="Times New Roman" w:hAnsi="Times New Roman"/>
+          <w:b/>
+          <w:sz w:val="24"/>
+        </w:rPr>
+        <w:t>Name: Raja Mandal</w:t>
+      </w:r>
+    </w:p>
+    <w:p>
+      <w:pPr>
+        <w:rPr>
+          <w:rFonts w:ascii="Times New Roman" w:hAnsi="Times New Roman"/>
+          <w:b/>
+          <w:sz w:val="24"/>
+        </w:rPr>
+      </w:pPr>
+    </w:p>
+    <w:p>
+      <w:pPr>
+        <w:rPr>
+          <w:rFonts w:ascii="Times New Roman" w:hAnsi="Times New Roman"/>
+          <w:b/>
+          <w:sz w:val="24"/>
+        </w:rPr>
+      </w:pPr>
+      <w:r>
+        <w:rPr>
+          <w:rFonts w:ascii="Times New Roman" w:hAnsi="Times New Roman"/>
+          <w:b/>
+          <w:sz w:val="24"/>
+        </w:rPr>
+        <w:t>Name: Raja Mandal</w:t>
+      </w:r>
+    </w:p>
+    <w:p>
+      <w:pPr>
+        <w:rPr>
+          <w:rFonts w:ascii="Times New Roman" w:hAnsi="Times New Roman"/>
+          <w:b/>
+          <w:sz w:val="24"/>
+        </w:rPr>
+      </w:pPr>
+      <w:r>
+        <w:rPr>
+          <w:rFonts w:ascii="Times New Roman" w:hAnsi="Times New Roman"/>
+          <w:b/>
+          <w:sz w:val="24"/>
+        </w:rPr>
+        <w:t xml:space="preserve">In progress: </w:t>
+      </w:r>
+    </w:p>
+    <w:p>
+      <w:pPr>
+        <w:rPr>
+          <w:rFonts w:ascii="Times New Roman" w:hAnsi="Times New Roman"/>
+          <w:b/>
+          <w:sz w:val="24"/>
+        </w:rPr>
+      </w:pPr>
+      <w:r>
+        <w:rPr>
+          <w:rFonts w:ascii="Times New Roman" w:hAnsi="Times New Roman"/>
+          <w:b/>
+          <w:noProof/>
+          <w:sz w:val="24"/>
+          <w:lang w:eastAsia="en-GB" w:bidi="ne-NP"/>
+        </w:rPr>
+        <mc:AlternateContent>
+          <mc:Choice Requires="wps">
+            <w:drawing>
+              <wp:anchor distT="0" distB="0" distL="114300" distR="114300" simplePos="0" relativeHeight="251731968" behindDoc="0" locked="0" layoutInCell="1" allowOverlap="1" wp14:anchorId="16ECBE92" wp14:editId="1357950C">
+                <wp:simplePos x="0" y="0"/>
+                <wp:positionH relativeFrom="column">
+                  <wp:posOffset>9525</wp:posOffset>
+                </wp:positionH>
+                <wp:positionV relativeFrom="paragraph">
+                  <wp:posOffset>47625</wp:posOffset>
+                </wp:positionV>
+                <wp:extent cx="5857875" cy="1074420"/>
+                <wp:effectExtent l="9525" t="5715" r="9525" b="5715"/>
+                <wp:wrapNone/>
+                <wp:docPr id="54370659" name="Rectangle 8"/>
+                <wp:cNvGraphicFramePr>
+                  <a:graphicFrameLocks xmlns:a="http://schemas.openxmlformats.org/drawingml/2006/main"/>
+                </wp:cNvGraphicFramePr>
+                <a:graphic xmlns:a="http://schemas.openxmlformats.org/drawingml/2006/main">
+                  <a:graphicData uri="http://schemas.microsoft.com/office/word/2010/wordprocessingShape">
+                    <wps:wsp>
+                      <wps:cNvSpPr>
+                        <a:spLocks noChangeArrowheads="1"/>
+                      </wps:cNvSpPr>
+                      <wps:spPr bwMode="auto">
+                        <a:xfrm>
+                          <a:off x="0" y="0"/>
+                          <a:ext cx="5857875" cy="1074420"/>
+                        </a:xfrm>
+                        <a:prstGeom prst="rect">
+                          <a:avLst/>
+                        </a:prstGeom>
+                        <a:solidFill>
+                          <a:srgbClr val="FFFFFF"/>
+                        </a:solidFill>
+                        <a:ln w="9525">
+                          <a:solidFill>
+                            <a:srgbClr val="000000"/>
+                          </a:solidFill>
+                          <a:miter lim="800000"/>
+                          <a:headEnd/>
+                          <a:tailEnd/>
+                        </a:ln>
+                      </wps:spPr>
+                      <wps:txbx>
+                        <w:txbxContent>
+                          <w:p>
+                            <w:pPr>
+                              <w:pStyle w:val="ListParagraph"/>
+                              <w:numPr>
+                                <w:ilvl w:val="0"/>
+                                <w:numId w:val="16"/>
+                              </w:numPr>
+                              <w:rPr>
+                                <w:lang w:val="en-US"/>
+                              </w:rPr>
+                            </w:pPr>
+                            <w:r>
+                              <w:rPr>
+                                <w:lang w:val="en-US"/>
+                              </w:rPr>
+                              <w:t>Timing Schedule page and admin functionality</w:t>
+                            </w:r>
+                          </w:p>
+                        </w:txbxContent>
+                      </wps:txbx>
+                      <wps:bodyPr rot="0" vert="horz" wrap="square" lIns="91440" tIns="45720" rIns="91440" bIns="45720" anchor="t" anchorCtr="0" upright="1">
+                        <a:noAutofit/>
+                      </wps:bodyPr>
+                    </wps:wsp>
+                  </a:graphicData>
+                </a:graphic>
+                <wp14:sizeRelH relativeFrom="page">
+                  <wp14:pctWidth>0</wp14:pctWidth>
+                </wp14:sizeRelH>
+                <wp14:sizeRelV relativeFrom="page">
+                  <wp14:pctHeight>0</wp14:pctHeight>
+                </wp14:sizeRelV>
+              </wp:anchor>
+            </w:drawing>
+          </mc:Choice>
+          <mc:Fallback>
+            <w:pict>
+              <v:rect w14:anchorId="16ECBE92" id="_x0000_s1056" style="position:absolute;margin-left:.75pt;margin-top:3.75pt;width:461.25pt;height:84.6pt;z-index:251731968;visibility:visible;mso-wrap-style:square;mso-width-percent:0;mso-height-percent:0;mso-wrap-distance-left:9pt;mso-wrap-distance-top:0;mso-wrap-distance-right:9pt;mso-wrap-distance-bottom:0;mso-position-horizontal:absolute;mso-position-horizontal-relative:text;mso-position-vertical:absolute;mso-position-vertical-relative:text;mso-width-percent:0;mso-height-percent:0;mso-width-relative:page;mso-height-relative:page;v-text-anchor:top" o:gfxdata="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">
+                <v:textbox>
+                  <w:txbxContent>
+                    <w:p>
+                      <w:pPr>
+                        <w:pStyle w:val="ListParagraph"/>
+                        <w:numPr>
+                          <w:ilvl w:val="0"/>
+                          <w:numId w:val="16"/>
+                        </w:numPr>
+                        <w:rPr>
+                          <w:lang w:val="en-US"/>
+                        </w:rPr>
+                      </w:pPr>
+                      <w:r>
+                        <w:rPr>
+                          <w:lang w:val="en-US"/>
+                        </w:rPr>
+                        <w:t>Timing Schedule page and admin functionality</w:t>
+                      </w:r>
+                    </w:p>
+                  </w:txbxContent>
+                </v:textbox>
+              </v:rect>
+            </w:pict>
+          </mc:Fallback>
+        </mc:AlternateContent>
+      </w:r>
+    </w:p>
+    <w:p>
+      <w:pPr>
+        <w:rPr>
+          <w:rFonts w:ascii="Times New Roman" w:hAnsi="Times New Roman"/>
+          <w:b/>
+          <w:sz w:val="24"/>
+        </w:rPr>
+      </w:pPr>
+    </w:p>
+    <w:p>
+      <w:pPr>
+        <w:rPr>
+          <w:rFonts w:ascii="Times New Roman" w:hAnsi="Times New Roman"/>
+          <w:b/>
+          <w:sz w:val="24"/>
+        </w:rPr>
+      </w:pPr>
+    </w:p>
+    <w:p>
+      <w:pPr>
+        <w:rPr>
+          <w:rFonts w:ascii="Times New Roman" w:hAnsi="Times New Roman"/>
+          <w:b/>
+          <w:sz w:val="24"/>
+        </w:rPr>
+      </w:pPr>
+    </w:p>
+    <w:p>
+      <w:pPr>
+        <w:rPr>
+          <w:rFonts w:ascii="Times New Roman" w:hAnsi="Times New Roman"/>
+          <w:b/>
+          <w:sz w:val="24"/>
+        </w:rPr>
+      </w:pPr>
+    </w:p>
+    <w:p>
+      <w:pPr>
+        <w:rPr>
+          <w:rFonts w:ascii="Times New Roman" w:hAnsi="Times New Roman"/>
+          <w:b/>
+          <w:sz w:val="24"/>
+        </w:rPr>
+      </w:pPr>
+    </w:p>
+    <w:p>
+      <w:pPr>
+        <w:rPr>
+          <w:rFonts w:ascii="Times New Roman" w:hAnsi="Times New Roman"/>
+          <w:b/>
+          <w:sz w:val="24"/>
+        </w:rPr>
+      </w:pPr>
+    </w:p>
+    <w:p>
+      <w:pPr>
+        <w:rPr>
+          <w:rFonts w:ascii="Times New Roman" w:hAnsi="Times New Roman"/>
+          <w:b/>
+          <w:sz w:val="24"/>
+        </w:rPr>
+      </w:pPr>
+      <w:r>
+        <w:rPr>
+          <w:rFonts w:ascii="Times New Roman" w:hAnsi="Times New Roman"/>
+          <w:b/>
+          <w:sz w:val="24"/>
+        </w:rPr>
+        <w:t>Completed:</w:t>
+      </w:r>
+    </w:p>
+    <w:p>
+      <w:pPr>
+        <w:rPr>
+          <w:rFonts w:ascii="Times New Roman" w:hAnsi="Times New Roman"/>
+          <w:b/>
+          <w:sz w:val="24"/>
+        </w:rPr>
+      </w:pPr>
+      <w:r>
+        <w:rPr>
+          <w:rFonts w:ascii="Times New Roman" w:hAnsi="Times New Roman"/>
+          <w:b/>
+          <w:noProof/>
+          <w:sz w:val="24"/>
+          <w:lang w:eastAsia="en-GB" w:bidi="ne-NP"/>
+        </w:rPr>
+        <mc:AlternateContent>
+          <mc:Choice Requires="wps">
+            <w:drawing>
+              <wp:anchor distT="0" distB="0" distL="114300" distR="114300" simplePos="0" relativeHeight="251732992" behindDoc="0" locked="0" layoutInCell="1" allowOverlap="1" wp14:anchorId="21FDB511" wp14:editId="1D182080">
+                <wp:simplePos x="0" y="0"/>
+                <wp:positionH relativeFrom="column">
+                  <wp:posOffset>0</wp:posOffset>
+                </wp:positionH>
+                <wp:positionV relativeFrom="paragraph">
+                  <wp:posOffset>47625</wp:posOffset>
+                </wp:positionV>
+                <wp:extent cx="5857875" cy="1074420"/>
+                <wp:effectExtent l="9525" t="5715" r="9525" b="5715"/>
+                <wp:wrapNone/>
+                <wp:docPr id="73531068" name="Rectangle 8"/>
+                <wp:cNvGraphicFramePr>
+                  <a:graphicFrameLocks xmlns:a="http://schemas.openxmlformats.org/drawingml/2006/main"/>
+                </wp:cNvGraphicFramePr>
+                <a:graphic xmlns:a="http://schemas.openxmlformats.org/drawingml/2006/main">
+                  <a:graphicData uri="http://schemas.microsoft.com/office/word/2010/wordprocessingShape">
+                    <wps:wsp>
+                      <wps:cNvSpPr>
+                        <a:spLocks noChangeArrowheads="1"/>
+                      </wps:cNvSpPr>
+                      <wps:spPr bwMode="auto">
+                        <a:xfrm>
+                          <a:off x="0" y="0"/>
+                          <a:ext cx="5857875" cy="1074420"/>
+                        </a:xfrm>
+                        <a:prstGeom prst="rect">
+                          <a:avLst/>
+                        </a:prstGeom>
+                        <a:solidFill>
+                          <a:srgbClr val="FFFFFF"/>
+                        </a:solidFill>
+                        <a:ln w="9525">
+                          <a:solidFill>
+                            <a:srgbClr val="000000"/>
+                          </a:solidFill>
+                          <a:miter lim="800000"/>
+                          <a:headEnd/>
+                          <a:tailEnd/>
+                        </a:ln>
+                      </wps:spPr>
+                      <wps:txbx>
+                        <w:txbxContent>
+                          <w:p>
+                            <w:pPr>
+                              <w:rPr>
+                                <w:lang w:val="en-US"/>
+                              </w:rPr>
+                            </w:pPr>
+                          </w:p>
+                        </w:txbxContent>
+                      </wps:txbx>
+                      <wps:bodyPr rot="0" vert="horz" wrap="square" lIns="91440" tIns="45720" rIns="91440" bIns="45720" anchor="t" anchorCtr="0" upright="1">
+                        <a:noAutofit/>
+                      </wps:bodyPr>
+                    </wps:wsp>
+                  </a:graphicData>
+                </a:graphic>
+                <wp14:sizeRelH relativeFrom="page">
+                  <wp14:pctWidth>0</wp14:pctWidth>
+                </wp14:sizeRelH>
+                <wp14:sizeRelV relativeFrom="page">
+                  <wp14:pctHeight>0</wp14:pctHeight>
+                </wp14:sizeRelV>
+              </wp:anchor>
+            </w:drawing>
+          </mc:Choice>
+          <mc:Fallback>
+            <w:pict>
+              <v:rect w14:anchorId="21FDB511" id="_x0000_s1057" style="position:absolute;margin-left:0;margin-top:3.75pt;width:461.25pt;height:84.6pt;z-index:251732992;visibility:visible;mso-wrap-style:square;mso-width-percent:0;mso-height-percent:0;mso-wrap-distance-left:9pt;mso-wrap-distance-top:0;mso-wrap-distance-right:9pt;mso-wrap-distance-bottom:0;mso-position-horizontal:absolute;mso-position-horizontal-relative:text;mso-position-vertical:absolute;mso-position-vertical-relative:text;mso-width-percent:0;mso-height-percent:0;mso-width-relative:page;mso-height-relative:page;v-text-anchor:top" o:gfxdata="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">
+                <v:textbox>
+                  <w:txbxContent>
+                    <w:p>
+                      <w:pPr>
+                        <w:rPr>
+                          <w:lang w:val="en-US"/>
+                        </w:rPr>
+                      </w:pPr>
+                    </w:p>
+                  </w:txbxContent>
+                </v:textbox>
+              </v:rect>
+            </w:pict>
+          </mc:Fallback>
+        </mc:AlternateContent>
+      </w:r>
+    </w:p>
+    <w:p>
+      <w:pPr>
+        <w:rPr>
+          <w:rFonts w:ascii="Times New Roman" w:hAnsi="Times New Roman"/>
+          <w:b/>
+          <w:sz w:val="24"/>
+        </w:rPr>
+      </w:pPr>
+    </w:p>
+    <w:p>
+      <w:pPr>
+        <w:rPr>
+          <w:rFonts w:ascii="Times New Roman" w:hAnsi="Times New Roman"/>
+          <w:b/>
+          <w:sz w:val="24"/>
+        </w:rPr>
+      </w:pPr>
+    </w:p>
+    <w:p>
+      <w:pPr>
+        <w:rPr>
+          <w:rFonts w:ascii="Times New Roman" w:hAnsi="Times New Roman"/>
+          <w:b/>
+          <w:sz w:val="24"/>
+        </w:rPr>
+      </w:pPr>
+      <w:r>
+        <w:rPr>
+          <w:rFonts w:ascii="Times New Roman" w:hAnsi="Times New Roman"/>
+          <w:b/>
+          <w:sz w:val="24"/>
+        </w:rPr>
+        <w:t>Observations</w:t>
+      </w:r>
+      <w:r>
+        <w:rPr>
+          <w:rFonts w:ascii="Times New Roman" w:hAnsi="Times New Roman"/>
+          <w:b/>
+          <w:sz w:val="24"/>
+        </w:rPr>
+        <w:t>:</w:t>
+      </w:r>
+    </w:p>
+    <w:p>
+      <w:pPr>
+        <w:rPr>
+          <w:rFonts w:ascii="Times New Roman" w:hAnsi="Times New Roman"/>
+          <w:b/>
+          <w:sz w:val="24"/>
+        </w:rPr>
+      </w:pPr>
+    </w:p>
+    <w:p>
+      <w:pPr>
+        <w:rPr>
+          <w:rFonts w:ascii="Times New Roman" w:hAnsi="Times New Roman"/>
+          <w:b/>
+          <w:sz w:val="24"/>
+        </w:rPr>
+      </w:pPr>
+    </w:p>
+    <w:p>
+      <w:pPr>
+        <w:rPr>
+          <w:rFonts w:ascii="Times New Roman" w:hAnsi="Times New Roman"/>
+          <w:b/>
+          <w:sz w:val="24"/>
+        </w:rPr>
+      </w:pPr>
+    </w:p>
+    <w:p>
+      <w:pPr>
+        <w:rPr>
+          <w:rFonts w:ascii="Times New Roman" w:hAnsi="Times New Roman"/>
+          <w:b/>
+          <w:sz w:val="24"/>
+        </w:rPr>
+      </w:pPr>
+      <w:r>
+        <w:rPr>
+          <w:rFonts w:ascii="Times New Roman" w:hAnsi="Times New Roman"/>
+          <w:b/>
+          <w:sz w:val="24"/>
+        </w:rPr>
+        <w:t>Plan for Next Week</w:t>
+      </w:r>
+      <w:r>
+        <w:rPr>
+          <w:rFonts w:ascii="Times New Roman" w:hAnsi="Times New Roman"/>
+          <w:b/>
+          <w:sz w:val="24"/>
+        </w:rPr>
+        <w:t>:</w:t>
+      </w:r>
+    </w:p>
+    <w:p>
+      <w:pPr>
+        <w:rPr>
+          <w:rFonts w:ascii="Times New Roman" w:hAnsi="Times New Roman"/>
+          <w:b/>
+          <w:sz w:val="24"/>
+        </w:rPr>
+      </w:pPr>
+      <w:r>
+        <w:rPr>
+          <w:rFonts w:ascii="Times New Roman" w:hAnsi="Times New Roman"/>
+          <w:b/>
+          <w:sz w:val="24"/>
+        </w:rPr>
+        <w:t>Name: Shulabh Shrestha</w:t>
+      </w:r>
+    </w:p>
+    <w:p>
+      <w:pPr>
+        <w:rPr>
+          <w:rFonts w:ascii="Times New Roman" w:hAnsi="Times New Roman"/>
+          <w:b/>
+          <w:sz w:val="24"/>
+        </w:rPr>
+      </w:pPr>
+      <w:r>
+        <w:rPr>
+          <w:rFonts w:ascii="Times New Roman" w:hAnsi="Times New Roman"/>
+          <w:b/>
+          <w:noProof/>
+          <w:sz w:val="24"/>
+          <w:lang w:eastAsia="en-GB" w:bidi="ne-NP"/>
+        </w:rPr>
+        <mc:AlternateContent>
+          <mc:Choice Requires="wps">
+            <w:drawing>
+              <wp:anchor distT="0" distB="0" distL="114300" distR="114300" simplePos="0" relativeHeight="251718656" behindDoc="0" locked="0" layoutInCell="1" allowOverlap="1" wp14:anchorId="7FA7F2EC" wp14:editId="691F373A">
+                <wp:simplePos x="0" y="0"/>
+                <wp:positionH relativeFrom="column">
+                  <wp:posOffset>9525</wp:posOffset>
+                </wp:positionH>
+                <wp:positionV relativeFrom="paragraph">
+                  <wp:posOffset>47625</wp:posOffset>
+                </wp:positionV>
+                <wp:extent cx="5857875" cy="1074420"/>
+                <wp:effectExtent l="9525" t="5715" r="9525" b="5715"/>
+                <wp:wrapNone/>
+                <wp:docPr id="1340380243" name="Rectangle 8"/>
+                <wp:cNvGraphicFramePr>
+                  <a:graphicFrameLocks xmlns:a="http://schemas.openxmlformats.org/drawingml/2006/main"/>
+                </wp:cNvGraphicFramePr>
+                <a:graphic xmlns:a="http://schemas.openxmlformats.org/drawingml/2006/main">
+                  <a:graphicData uri="http://schemas.microsoft.com/office/word/2010/wordprocessingShape">
+                    <wps:wsp>
+                      <wps:cNvSpPr>
+                        <a:spLocks noChangeArrowheads="1"/>
+                      </wps:cNvSpPr>
+                      <wps:spPr bwMode="auto">
+                        <a:xfrm>
+                          <a:off x="0" y="0"/>
+                          <a:ext cx="5857875" cy="1074420"/>
+                        </a:xfrm>
+                        <a:prstGeom prst="rect">
+                          <a:avLst/>
+                        </a:prstGeom>
+                        <a:solidFill>
+                          <a:srgbClr val="FFFFFF"/>
+                        </a:solidFill>
+                        <a:ln w="9525">
+                          <a:solidFill>
+                            <a:srgbClr val="000000"/>
+                          </a:solidFill>
+                          <a:miter lim="800000"/>
+                          <a:headEnd/>
+                          <a:tailEnd/>
+                        </a:ln>
+                      </wps:spPr>
+                      <wps:txbx>
+                        <w:txbxContent>
+                          <w:p>
+                            <w:pPr>
+                              <w:pStyle w:val="ListParagraph"/>
+                              <w:numPr>
+                                <w:ilvl w:val="0"/>
+                                <w:numId w:val="17"/>
+                              </w:numPr>
+                              <w:rPr>
+                                <w:lang w:val="en-US"/>
+                              </w:rPr>
+                            </w:pPr>
+                            <w:r>
+                              <w:rPr>
+                                <w:lang w:val="en-US"/>
+                              </w:rPr>
+                              <w:t>Work with functionality of reserved orders being collected into kitchen report after a certain timing schedule has been reached</w:t>
+                            </w:r>
+                            <w:r>
+                              <w:rPr>
+                                <w:lang w:val="en-US"/>
+                              </w:rPr>
+                              <w:t xml:space="preserve"> </w:t>
+                            </w:r>
+                            <w:r>
+                              <w:rPr>
+                                <w:lang w:val="en-US"/>
+                              </w:rPr>
+                              <w:t>and deduct balance based on items ordered successfully</w:t>
+                            </w:r>
+                          </w:p>
+                          <w:p>
+                            <w:pPr>
+                              <w:ind w:left="360"/>
+                              <w:rPr>
+                                <w:lang w:val="en-US"/>
+                              </w:rPr>
+                            </w:pPr>
+                          </w:p>
+                        </w:txbxContent>
+                      </wps:txbx>
+                      <wps:bodyPr rot="0" vert="horz" wrap="square" lIns="91440" tIns="45720" rIns="91440" bIns="45720" anchor="t" anchorCtr="0" upright="1">
+                        <a:noAutofit/>
+                      </wps:bodyPr>
+                    </wps:wsp>
+                  </a:graphicData>
+                </a:graphic>
+                <wp14:sizeRelH relativeFrom="page">
+                  <wp14:pctWidth>0</wp14:pctWidth>
+                </wp14:sizeRelH>
+                <wp14:sizeRelV relativeFrom="page">
+                  <wp14:pctHeight>0</wp14:pctHeight>
+                </wp14:sizeRelV>
+              </wp:anchor>
+            </w:drawing>
+          </mc:Choice>
+          <mc:Fallback>
+            <w:pict>
+              <v:rect w14:anchorId="7FA7F2EC" id="_x0000_s1058" style="position:absolute;margin-left:.75pt;margin-top:3.75pt;width:461.25pt;height:84.6pt;z-index:251718656;visibility:visible;mso-wrap-style:square;mso-width-percent:0;mso-height-percent:0;mso-wrap-distance-left:9pt;mso-wrap-distance-top:0;mso-wrap-distance-right:9pt;mso-wrap-distance-bottom:0;mso-position-horizontal:absolute;mso-position-horizontal-relative:text;mso-position-vertical:absolute;mso-position-vertical-relative:text;mso-width-percent:0;mso-height-percent:0;mso-width-relative:page;mso-height-relative:page;v-text-anchor:top" o:gfxdata="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">
+                <v:textbox>
+                  <w:txbxContent>
+                    <w:p>
+                      <w:pPr>
+                        <w:pStyle w:val="ListParagraph"/>
+                        <w:numPr>
+                          <w:ilvl w:val="0"/>
+                          <w:numId w:val="17"/>
+                        </w:numPr>
+                        <w:rPr>
+                          <w:lang w:val="en-US"/>
+                        </w:rPr>
+                      </w:pPr>
+                      <w:r>
+                        <w:rPr>
+                          <w:lang w:val="en-US"/>
+                        </w:rPr>
+                        <w:t>Work with functionality of reserved orders being collected into kitchen report after a certain timing schedule has been reached</w:t>
+                      </w:r>
+                      <w:r>
+                        <w:rPr>
+                          <w:lang w:val="en-US"/>
+                        </w:rPr>
+                        <w:t xml:space="preserve"> </w:t>
+                      </w:r>
+                      <w:r>
+                        <w:rPr>
+                          <w:lang w:val="en-US"/>
+                        </w:rPr>
+                        <w:t>and deduct balance based on items ordered successfully</w:t>
+                      </w:r>
+                    </w:p>
+                    <w:p>
+                      <w:pPr>
+                        <w:ind w:left="360"/>
+                        <w:rPr>
+                          <w:lang w:val="en-US"/>
+                        </w:rPr>
+                      </w:pPr>
+                    </w:p>
+                  </w:txbxContent>
+                </v:textbox>
+              </v:rect>
+            </w:pict>
+          </mc:Fallback>
+        </mc:AlternateContent>
+      </w:r>
+    </w:p>
+    <w:p>
+      <w:pPr>
+        <w:rPr>
+          <w:rFonts w:ascii="Times New Roman" w:hAnsi="Times New Roman"/>
+          <w:b/>
+          <w:sz w:val="24"/>
+        </w:rPr>
+      </w:pPr>
+    </w:p>
+    <w:p>
+      <w:pPr>
+        <w:rPr>
+          <w:rFonts w:ascii="Times New Roman" w:hAnsi="Times New Roman"/>
+          <w:b/>
+          <w:sz w:val="24"/>
+        </w:rPr>
+      </w:pPr>
+    </w:p>
+    <w:p>
+      <w:pPr>
+        <w:rPr>
+          <w:rFonts w:ascii="Times New Roman" w:hAnsi="Times New Roman"/>
+          <w:b/>
+          <w:sz w:val="24"/>
+        </w:rPr>
+      </w:pPr>
+    </w:p>
+    <w:p>
+      <w:pPr>
+        <w:rPr>
+          <w:rFonts w:ascii="Times New Roman" w:hAnsi="Times New Roman"/>
+          <w:b/>
+          <w:sz w:val="24"/>
+        </w:rPr>
+      </w:pPr>
+    </w:p>
+    <w:p>
+      <w:pPr>
+        <w:rPr>
+          <w:rFonts w:ascii="Times New Roman" w:hAnsi="Times New Roman"/>
+          <w:b/>
+          <w:sz w:val="24"/>
+        </w:rPr>
+      </w:pPr>
+    </w:p>
+    <w:p>
+      <w:pPr>
+        <w:rPr>
+          <w:rFonts w:ascii="Times New Roman" w:hAnsi="Times New Roman"/>
+          <w:b/>
+          <w:sz w:val="24"/>
+        </w:rPr>
+      </w:pPr>
+    </w:p>
+    <w:p>
+      <w:pPr>
+        <w:rPr>
+          <w:rFonts w:ascii="Times New Roman" w:hAnsi="Times New Roman"/>
+          <w:b/>
+          <w:sz w:val="24"/>
+        </w:rPr>
+      </w:pPr>
+      <w:r>
+        <w:rPr>
+          <w:rFonts w:ascii="Times New Roman" w:hAnsi="Times New Roman"/>
+          <w:b/>
+          <w:sz w:val="24"/>
+        </w:rPr>
+        <w:t xml:space="preserve">Name: </w:t>
+      </w:r>
+      <w:proofErr w:type="spellStart"/>
+      <w:r>
+        <w:rPr>
+          <w:rFonts w:ascii="Times New Roman" w:hAnsi="Times New Roman"/>
+          <w:b/>
+          <w:sz w:val="24"/>
+        </w:rPr>
+        <w:t>Saistha</w:t>
+      </w:r>
+      <w:proofErr w:type="spellEnd"/>
+      <w:r>
+        <w:rPr>
+          <w:rFonts w:ascii="Times New Roman" w:hAnsi="Times New Roman"/>
+          <w:b/>
+          <w:sz w:val="24"/>
+        </w:rPr>
+        <w:t xml:space="preserve"> Pradhan</w:t>
+      </w:r>
+    </w:p>
+    <w:p>
+      <w:pPr>
+        <w:rPr>
+          <w:rFonts w:ascii="Times New Roman" w:hAnsi="Times New Roman"/>
+          <w:b/>
+          <w:sz w:val="24"/>
+        </w:rPr>
+      </w:pPr>
+      <w:r>
+        <w:rPr>
+          <w:rFonts w:ascii="Times New Roman" w:hAnsi="Times New Roman"/>
+          <w:b/>
+          <w:noProof/>
+          <w:sz w:val="24"/>
+          <w:lang w:eastAsia="en-GB" w:bidi="ne-NP"/>
+        </w:rPr>
+        <mc:AlternateContent>
+          <mc:Choice Requires="wps">
+            <w:drawing>
+              <wp:anchor distT="0" distB="0" distL="114300" distR="114300" simplePos="0" relativeHeight="251719680" behindDoc="0" locked="0" layoutInCell="1" allowOverlap="1" wp14:anchorId="6D9690B2" wp14:editId="4439FAB2">
+                <wp:simplePos x="0" y="0"/>
+                <wp:positionH relativeFrom="column">
+                  <wp:posOffset>0</wp:posOffset>
+                </wp:positionH>
+                <wp:positionV relativeFrom="paragraph">
+                  <wp:posOffset>47625</wp:posOffset>
+                </wp:positionV>
+                <wp:extent cx="5857875" cy="1074420"/>
+                <wp:effectExtent l="9525" t="5715" r="9525" b="5715"/>
+                <wp:wrapNone/>
+                <wp:docPr id="785860358" name="Rectangle 8"/>
+                <wp:cNvGraphicFramePr>
+                  <a:graphicFrameLocks xmlns:a="http://schemas.openxmlformats.org/drawingml/2006/main"/>
+                </wp:cNvGraphicFramePr>
+                <a:graphic xmlns:a="http://schemas.openxmlformats.org/drawingml/2006/main">
+                  <a:graphicData uri="http://schemas.microsoft.com/office/word/2010/wordprocessingShape">
+                    <wps:wsp>
+                      <wps:cNvSpPr>
+                        <a:spLocks noChangeArrowheads="1"/>
+                      </wps:cNvSpPr>
+                      <wps:spPr bwMode="auto">
+                        <a:xfrm>
+                          <a:off x="0" y="0"/>
+                          <a:ext cx="5857875" cy="1074420"/>
+                        </a:xfrm>
+                        <a:prstGeom prst="rect">
+                          <a:avLst/>
+                        </a:prstGeom>
+                        <a:solidFill>
+                          <a:srgbClr val="FFFFFF"/>
+                        </a:solidFill>
+                        <a:ln w="9525">
+                          <a:solidFill>
+                            <a:srgbClr val="000000"/>
+                          </a:solidFill>
+                          <a:miter lim="800000"/>
+                          <a:headEnd/>
+                          <a:tailEnd/>
+                        </a:ln>
+                      </wps:spPr>
+                      <wps:txbx>
+                        <w:txbxContent>
+                          <w:p>
+                            <w:pPr>
+                              <w:pStyle w:val="ListParagraph"/>
+                              <w:numPr>
+                                <w:ilvl w:val="0"/>
+                                <w:numId w:val="18"/>
+                              </w:numPr>
+                              <w:rPr>
+                                <w:lang w:val="en-US"/>
+                              </w:rPr>
+                            </w:pPr>
+                            <w:r>
+                              <w:rPr>
+                                <w:lang w:val="en-US"/>
+                              </w:rPr>
+                              <w:t>Work with functionality of users being able to reserve orders</w:t>
+                            </w:r>
+                          </w:p>
+                        </w:txbxContent>
+                      </wps:txbx>
+                      <wps:bodyPr rot="0" vert="horz" wrap="square" lIns="91440" tIns="45720" rIns="91440" bIns="45720" anchor="t" anchorCtr="0" upright="1">
+                        <a:noAutofit/>
+                      </wps:bodyPr>
+                    </wps:wsp>
+                  </a:graphicData>
+                </a:graphic>
+                <wp14:sizeRelH relativeFrom="page">
+                  <wp14:pctWidth>0</wp14:pctWidth>
+                </wp14:sizeRelH>
+                <wp14:sizeRelV relativeFrom="page">
+                  <wp14:pctHeight>0</wp14:pctHeight>
+                </wp14:sizeRelV>
+              </wp:anchor>
+            </w:drawing>
+          </mc:Choice>
+          <mc:Fallback>
+            <w:pict>
+              <v:rect w14:anchorId="6D9690B2" id="_x0000_s1059" style="position:absolute;margin-left:0;margin-top:3.75pt;width:461.25pt;height:84.6pt;z-index:251719680;visibility:visible;mso-wrap-style:square;mso-width-percent:0;mso-height-percent:0;mso-wrap-distance-left:9pt;mso-wrap-distance-top:0;mso-wrap-distance-right:9pt;mso-wrap-distance-bottom:0;mso-position-horizontal:absolute;mso-position-horizontal-relative:text;mso-position-vertical:absolute;mso-position-vertical-relative:text;mso-width-percent:0;mso-height-percent:0;mso-width-relative:page;mso-height-relative:page;v-text-anchor:top" o:gfxdata="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">
+                <v:textbox>
+                  <w:txbxContent>
+                    <w:p>
+                      <w:pPr>
+                        <w:pStyle w:val="ListParagraph"/>
+                        <w:numPr>
+                          <w:ilvl w:val="0"/>
+                          <w:numId w:val="18"/>
+                        </w:numPr>
+                        <w:rPr>
+                          <w:lang w:val="en-US"/>
+                        </w:rPr>
+                      </w:pPr>
+                      <w:r>
+                        <w:rPr>
+                          <w:lang w:val="en-US"/>
+                        </w:rPr>
+                        <w:t>Work with functionality of users being able to reserve orders</w:t>
+                      </w:r>
+                    </w:p>
+                  </w:txbxContent>
+                </v:textbox>
+              </v:rect>
+            </w:pict>
+          </mc:Fallback>
+        </mc:AlternateContent>
+      </w:r>
+    </w:p>
+    <w:p>
+      <w:pPr>
+        <w:rPr>
+          <w:rFonts w:ascii="Times New Roman" w:hAnsi="Times New Roman"/>
+          <w:b/>
+          <w:sz w:val="24"/>
+        </w:rPr>
+      </w:pPr>
+    </w:p>
+    <w:p>
+      <w:pPr>
+        <w:rPr>
+          <w:rFonts w:ascii="Times New Roman" w:hAnsi="Times New Roman"/>
+          <w:b/>
+          <w:sz w:val="24"/>
+        </w:rPr>
+      </w:pPr>
+    </w:p>
+    <w:p>
+      <w:pPr>
+        <w:rPr>
+          <w:rFonts w:ascii="Times New Roman" w:hAnsi="Times New Roman"/>
+          <w:b/>
+          <w:sz w:val="24"/>
+        </w:rPr>
+      </w:pPr>
+      <w:r>
+        <w:rPr>
+          <w:rFonts w:ascii="Times New Roman" w:hAnsi="Times New Roman"/>
+          <w:b/>
+          <w:sz w:val="24"/>
+        </w:rPr>
+        <w:t>Observations</w:t>
+      </w:r>
+      <w:r>
+        <w:rPr>
+          <w:rFonts w:ascii="Times New Roman" w:hAnsi="Times New Roman"/>
+          <w:b/>
+          <w:sz w:val="24"/>
+        </w:rPr>
+        <w:t>:</w:t>
+      </w:r>
+    </w:p>
+    <w:p>
+      <w:pPr>
+        <w:rPr>
+          <w:rFonts w:ascii="Times New Roman" w:hAnsi="Times New Roman"/>
+          <w:b/>
+          <w:sz w:val="24"/>
+        </w:rPr>
+      </w:pPr>
+    </w:p>
+    <w:p>
+      <w:pPr>
+        <w:rPr>
+          <w:rFonts w:ascii="Times New Roman" w:hAnsi="Times New Roman"/>
+          <w:b/>
+          <w:sz w:val="24"/>
+        </w:rPr>
+      </w:pPr>
+    </w:p>
+    <w:p>
+      <w:pPr>
+        <w:rPr>
+          <w:rFonts w:ascii="Times New Roman" w:hAnsi="Times New Roman"/>
+          <w:b/>
+          <w:sz w:val="24"/>
+        </w:rPr>
+      </w:pPr>
+    </w:p>
+    <w:p>
+      <w:pPr>
+        <w:rPr>
+          <w:rFonts w:ascii="Times New Roman" w:hAnsi="Times New Roman"/>
+          <w:b/>
+          <w:sz w:val="24"/>
+        </w:rPr>
+      </w:pPr>
+      <w:r>
+        <w:rPr>
+          <w:rFonts w:ascii="Times New Roman" w:hAnsi="Times New Roman"/>
+          <w:b/>
+          <w:sz w:val="24"/>
+        </w:rPr>
+        <w:t>Name: Aishwarya Prashant</w:t>
+      </w:r>
+    </w:p>
+    <w:p>
+      <w:pPr>
+        <w:rPr>
+          <w:rFonts w:ascii="Times New Roman" w:hAnsi="Times New Roman"/>
+          <w:b/>
+          <w:sz w:val="24"/>
+        </w:rPr>
+      </w:pPr>
+      <w:r>
+        <w:rPr>
+          <w:rFonts w:ascii="Times New Roman" w:hAnsi="Times New Roman"/>
+          <w:b/>
+          <w:noProof/>
+          <w:sz w:val="24"/>
+          <w:lang w:eastAsia="en-GB" w:bidi="ne-NP"/>
+        </w:rPr>
+        <mc:AlternateContent>
+          <mc:Choice Requires="wps">
+            <w:drawing>
+              <wp:anchor distT="0" distB="0" distL="114300" distR="114300" simplePos="0" relativeHeight="251720704" behindDoc="0" locked="0" layoutInCell="1" allowOverlap="1" wp14:anchorId="7F534638" wp14:editId="38B9BE17">
+                <wp:simplePos x="0" y="0"/>
+                <wp:positionH relativeFrom="column">
+                  <wp:posOffset>-19050</wp:posOffset>
+                </wp:positionH>
+                <wp:positionV relativeFrom="paragraph">
+                  <wp:posOffset>70485</wp:posOffset>
+                </wp:positionV>
+                <wp:extent cx="5857875" cy="1074420"/>
+                <wp:effectExtent l="9525" t="5715" r="9525" b="5715"/>
+                <wp:wrapNone/>
+                <wp:docPr id="48314337" name="Rectangle 8"/>
+                <wp:cNvGraphicFramePr>
+                  <a:graphicFrameLocks xmlns:a="http://schemas.openxmlformats.org/drawingml/2006/main"/>
+                </wp:cNvGraphicFramePr>
+                <a:graphic xmlns:a="http://schemas.openxmlformats.org/drawingml/2006/main">
+                  <a:graphicData uri="http://schemas.microsoft.com/office/word/2010/wordprocessingShape">
+                    <wps:wsp>
+                      <wps:cNvSpPr>
+                        <a:spLocks noChangeArrowheads="1"/>
+                      </wps:cNvSpPr>
+                      <wps:spPr bwMode="auto">
+                        <a:xfrm>
+                          <a:off x="0" y="0"/>
+                          <a:ext cx="5857875" cy="1074420"/>
+                        </a:xfrm>
+                        <a:prstGeom prst="rect">
+                          <a:avLst/>
+                        </a:prstGeom>
+                        <a:solidFill>
+                          <a:srgbClr val="FFFFFF"/>
+                        </a:solidFill>
+                        <a:ln w="9525">
+                          <a:solidFill>
+                            <a:srgbClr val="000000"/>
+                          </a:solidFill>
+                          <a:miter lim="800000"/>
+                          <a:headEnd/>
+                          <a:tailEnd/>
+                        </a:ln>
+                      </wps:spPr>
+                      <wps:txbx>
+                        <w:txbxContent>
+                          <w:p>
+                            <w:pPr>
+                              <w:rPr>
+                                <w:lang w:val="en-US"/>
+                              </w:rPr>
+                            </w:pPr>
+                            <w:r>
+                              <w:rPr>
+                                <w:lang w:val="en-US"/>
+                              </w:rPr>
+                              <w:t xml:space="preserve">1. </w:t>
+                            </w:r>
+                            <w:r>
+                              <w:rPr>
+                                <w:lang w:val="en-US"/>
+                              </w:rPr>
+                              <w:t xml:space="preserve">Work with functionality for user to be able to cancel reserved order </w:t>
+                            </w:r>
+                          </w:p>
+                        </w:txbxContent>
+                      </wps:txbx>
+                      <wps:bodyPr rot="0" vert="horz" wrap="square" lIns="91440" tIns="45720" rIns="91440" bIns="45720" anchor="t" anchorCtr="0" upright="1">
+                        <a:noAutofit/>
+                      </wps:bodyPr>
+                    </wps:wsp>
+                  </a:graphicData>
+                </a:graphic>
+                <wp14:sizeRelH relativeFrom="page">
+                  <wp14:pctWidth>0</wp14:pctWidth>
+                </wp14:sizeRelH>
+                <wp14:sizeRelV relativeFrom="page">
+                  <wp14:pctHeight>0</wp14:pctHeight>
+                </wp14:sizeRelV>
+              </wp:anchor>
+            </w:drawing>
+          </mc:Choice>
+          <mc:Fallback>
+            <w:pict>
+              <v:rect w14:anchorId="7F534638" id="_x0000_s1060" style="position:absolute;margin-left:-1.5pt;margin-top:5.55pt;width:461.25pt;height:84.6pt;z-index:251720704;visibility:visible;mso-wrap-style:square;mso-width-percent:0;mso-height-percent:0;mso-wrap-distance-left:9pt;mso-wrap-distance-top:0;mso-wrap-distance-right:9pt;mso-wrap-distance-bottom:0;mso-position-horizontal:absolute;mso-position-horizontal-relative:text;mso-position-vertical:absolute;mso-position-vertical-relative:text;mso-width-percent:0;mso-height-percent:0;mso-width-relative:page;mso-height-relative:page;v-text-anchor:top" o:gfxdata="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">
+                <v:textbox>
+                  <w:txbxContent>
+                    <w:p>
+                      <w:pPr>
+                        <w:rPr>
+                          <w:lang w:val="en-US"/>
+                        </w:rPr>
+                      </w:pPr>
+                      <w:r>
+                        <w:rPr>
+                          <w:lang w:val="en-US"/>
+                        </w:rPr>
+                        <w:t xml:space="preserve">1. </w:t>
+                      </w:r>
+                      <w:r>
+                        <w:rPr>
+                          <w:lang w:val="en-US"/>
+                        </w:rPr>
+                        <w:t xml:space="preserve">Work with functionality for user to be able to cancel reserved order </w:t>
+                      </w:r>
+                    </w:p>
+                  </w:txbxContent>
+                </v:textbox>
+              </v:rect>
+            </w:pict>
+          </mc:Fallback>
+        </mc:AlternateContent>
+      </w:r>
+    </w:p>
+    <w:p>
+      <w:pPr>
+        <w:rPr>
+          <w:rFonts w:ascii="Times New Roman" w:hAnsi="Times New Roman"/>
+          <w:b/>
+          <w:sz w:val="24"/>
+        </w:rPr>
+      </w:pPr>
+    </w:p>
+    <w:p>
+      <w:pPr>
+        <w:rPr>
+          <w:rFonts w:ascii="Times New Roman" w:hAnsi="Times New Roman"/>
+          <w:b/>
+          <w:sz w:val="24"/>
+        </w:rPr>
+      </w:pPr>
+    </w:p>
+    <w:p>
+      <w:pPr>
+        <w:rPr>
+          <w:rFonts w:ascii="Times New Roman" w:hAnsi="Times New Roman"/>
+          <w:b/>
+          <w:sz w:val="24"/>
+        </w:rPr>
+      </w:pPr>
+      <w:r>
+        <w:rPr>
+          <w:rFonts w:ascii="Times New Roman" w:hAnsi="Times New Roman"/>
+          <w:b/>
+          <w:sz w:val="24"/>
+        </w:rPr>
+        <w:br/>
+      </w:r>
+    </w:p>
+    <w:p>
+      <w:pPr>
+        <w:rPr>
+          <w:rFonts w:ascii="Times New Roman" w:hAnsi="Times New Roman"/>
+          <w:b/>
+          <w:sz w:val="24"/>
+        </w:rPr>
+      </w:pPr>
+    </w:p>
+    <w:p>
+      <w:pPr>
+        <w:rPr>
+          <w:rFonts w:ascii="Times New Roman" w:hAnsi="Times New Roman"/>
+          <w:b/>
+          <w:sz w:val="24"/>
+        </w:rPr>
+      </w:pPr>
+    </w:p>
+    <w:p>
+      <w:pPr>
+        <w:rPr>
+          <w:rFonts w:ascii="Times New Roman" w:hAnsi="Times New Roman"/>
+          <w:b/>
+          <w:sz w:val="24"/>
+        </w:rPr>
+      </w:pPr>
+    </w:p>
+    <w:p>
+      <w:pPr>
+        <w:rPr>
+          <w:rFonts w:ascii="Times New Roman" w:hAnsi="Times New Roman"/>
+          <w:b/>
+          <w:sz w:val="24"/>
+        </w:rPr>
+      </w:pPr>
+      <w:r>
+        <w:rPr>
+          <w:rFonts w:ascii="Times New Roman" w:hAnsi="Times New Roman"/>
+          <w:b/>
+          <w:sz w:val="24"/>
+        </w:rPr>
+        <w:lastRenderedPageBreak/>
+        <w:t>Name: Raja Mandal</w:t>
+      </w:r>
+    </w:p>
+    <w:p>
+      <w:pPr>
+        <w:rPr>
+          <w:rFonts w:ascii="Times New Roman" w:hAnsi="Times New Roman"/>
+          <w:b/>
+          <w:sz w:val="24"/>
+        </w:rPr>
+      </w:pPr>
+      <w:r>
+        <w:rPr>
+          <w:rFonts w:ascii="Times New Roman" w:hAnsi="Times New Roman"/>
+          <w:b/>
+          <w:noProof/>
+          <w:sz w:val="24"/>
+          <w:lang w:eastAsia="en-GB" w:bidi="ne-NP"/>
+        </w:rPr>
+        <mc:AlternateContent>
+          <mc:Choice Requires="wps">
+            <w:drawing>
+              <wp:anchor distT="0" distB="0" distL="114300" distR="114300" simplePos="0" relativeHeight="251721728" behindDoc="0" locked="0" layoutInCell="1" allowOverlap="1" wp14:anchorId="48BE59FD" wp14:editId="498F0C63">
+                <wp:simplePos x="0" y="0"/>
+                <wp:positionH relativeFrom="column">
+                  <wp:posOffset>-9525</wp:posOffset>
+                </wp:positionH>
+                <wp:positionV relativeFrom="paragraph">
+                  <wp:posOffset>44450</wp:posOffset>
+                </wp:positionV>
+                <wp:extent cx="5857875" cy="1074420"/>
+                <wp:effectExtent l="9525" t="5715" r="9525" b="5715"/>
+                <wp:wrapNone/>
+                <wp:docPr id="397774579" name="Rectangle 8"/>
+                <wp:cNvGraphicFramePr>
+                  <a:graphicFrameLocks xmlns:a="http://schemas.openxmlformats.org/drawingml/2006/main"/>
+                </wp:cNvGraphicFramePr>
+                <a:graphic xmlns:a="http://schemas.openxmlformats.org/drawingml/2006/main">
+                  <a:graphicData uri="http://schemas.microsoft.com/office/word/2010/wordprocessingShape">
+                    <wps:wsp>
+                      <wps:cNvSpPr>
+                        <a:spLocks noChangeArrowheads="1"/>
+                      </wps:cNvSpPr>
+                      <wps:spPr bwMode="auto">
+                        <a:xfrm>
+                          <a:off x="0" y="0"/>
+                          <a:ext cx="5857875" cy="1074420"/>
+                        </a:xfrm>
+                        <a:prstGeom prst="rect">
+                          <a:avLst/>
+                        </a:prstGeom>
+                        <a:solidFill>
+                          <a:srgbClr val="FFFFFF"/>
+                        </a:solidFill>
+                        <a:ln w="9525">
+                          <a:solidFill>
+                            <a:srgbClr val="000000"/>
+                          </a:solidFill>
+                          <a:miter lim="800000"/>
+                          <a:headEnd/>
+                          <a:tailEnd/>
+                        </a:ln>
+                      </wps:spPr>
+                      <wps:txbx>
+                        <w:txbxContent>
+                          <w:p>
+                            <w:pPr>
+                              <w:rPr>
+                                <w:lang w:val="en-US"/>
+                              </w:rPr>
+                            </w:pPr>
+                            <w:r>
+                              <w:rPr>
+                                <w:lang w:val="en-US"/>
+                              </w:rPr>
+                              <w:t xml:space="preserve">1. </w:t>
+                            </w:r>
+                            <w:r>
+                              <w:rPr>
+                                <w:lang w:val="en-US"/>
+                              </w:rPr>
+                              <w:t>Brainstorming ideas to decide how to handle stocks and make sure reserved amount does not go over the existing stock to prevent over-preordering items causing massive errors</w:t>
+                            </w:r>
+                          </w:p>
+                        </w:txbxContent>
+                      </wps:txbx>
+                      <wps:bodyPr rot="0" vert="horz" wrap="square" lIns="91440" tIns="45720" rIns="91440" bIns="45720" anchor="t" anchorCtr="0" upright="1">
+                        <a:noAutofit/>
+                      </wps:bodyPr>
+                    </wps:wsp>
+                  </a:graphicData>
+                </a:graphic>
+                <wp14:sizeRelH relativeFrom="page">
+                  <wp14:pctWidth>0</wp14:pctWidth>
+                </wp14:sizeRelH>
+                <wp14:sizeRelV relativeFrom="page">
+                  <wp14:pctHeight>0</wp14:pctHeight>
+                </wp14:sizeRelV>
+              </wp:anchor>
+            </w:drawing>
+          </mc:Choice>
+          <mc:Fallback>
+            <w:pict>
+              <v:rect w14:anchorId="48BE59FD" id="_x0000_s1061" style="position:absolute;margin-left:-.75pt;margin-top:3.5pt;width:461.25pt;height:84.6pt;z-index:251721728;visibility:visible;mso-wrap-style:square;mso-width-percent:0;mso-height-percent:0;mso-wrap-distance-left:9pt;mso-wrap-distance-top:0;mso-wrap-distance-right:9pt;mso-wrap-distance-bottom:0;mso-position-horizontal:absolute;mso-position-horizontal-relative:text;mso-position-vertical:absolute;mso-position-vertical-relative:text;mso-width-percent:0;mso-height-percent:0;mso-width-relative:page;mso-height-relative:page;v-text-anchor:top" o:gfxdata="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">
+                <v:textbox>
+                  <w:txbxContent>
+                    <w:p>
+                      <w:pPr>
+                        <w:rPr>
+                          <w:lang w:val="en-US"/>
+                        </w:rPr>
+                      </w:pPr>
+                      <w:r>
+                        <w:rPr>
+                          <w:lang w:val="en-US"/>
+                        </w:rPr>
+                        <w:t xml:space="preserve">1. </w:t>
+                      </w:r>
+                      <w:r>
+                        <w:rPr>
+                          <w:lang w:val="en-US"/>
+                        </w:rPr>
+                        <w:t>Brainstorming ideas to decide how to handle stocks and make sure reserved amount does not go over the existing stock to prevent over-preordering items causing massive errors</w:t>
+                      </w:r>
+                    </w:p>
+                  </w:txbxContent>
+                </v:textbox>
+              </v:rect>
+            </w:pict>
+          </mc:Fallback>
+        </mc:AlternateContent>
+      </w:r>
+    </w:p>
+    <w:p>
+      <w:pPr>
+        <w:rPr>
+          <w:rFonts w:ascii="Times New Roman" w:hAnsi="Times New Roman"/>
+          <w:b/>
+          <w:sz w:val="24"/>
+        </w:rPr>
+      </w:pPr>
+    </w:p>
+    <w:p>
+      <w:pPr>
+        <w:rPr>
+          <w:rFonts w:ascii="Times New Roman" w:hAnsi="Times New Roman"/>
+          <w:b/>
+          <w:sz w:val="24"/>
+        </w:rPr>
+      </w:pPr>
+    </w:p>
+    <w:p>
+      <w:pPr>
+        <w:rPr>
+          <w:rFonts w:ascii="Times New Roman" w:hAnsi="Times New Roman"/>
+          <w:b/>
+          <w:sz w:val="24"/>
+        </w:rPr>
+      </w:pPr>
+    </w:p>
+    <w:p>
+      <w:pPr>
+        <w:rPr>
+          <w:rFonts w:ascii="Times New Roman" w:hAnsi="Times New Roman"/>
+          <w:b/>
+          <w:sz w:val="24"/>
+        </w:rPr>
+      </w:pPr>
+    </w:p>
+    <w:p>
+      <w:pPr>
+        <w:rPr>
+          <w:rFonts w:ascii="Times New Roman" w:hAnsi="Times New Roman"/>
+          <w:b/>
+          <w:sz w:val="24"/>
+        </w:rPr>
+      </w:pPr>
+    </w:p>
+    <w:p>
+      <w:pPr>
+        <w:rPr>
+          <w:rFonts w:ascii="Times New Roman" w:hAnsi="Times New Roman"/>
+          <w:b/>
+          <w:sz w:val="24"/>
+        </w:rPr>
+      </w:pPr>
+    </w:p>
+    <w:p>
+      <w:pPr>
+        <w:rPr>
+          <w:rFonts w:ascii="Times New Roman" w:hAnsi="Times New Roman"/>
+          <w:b/>
+          <w:sz w:val="24"/>
+        </w:rPr>
+      </w:pPr>
+      <w:r>
+        <w:rPr>
+          <w:rFonts w:ascii="Times New Roman" w:hAnsi="Times New Roman"/>
+          <w:b/>
+          <w:sz w:val="24"/>
+        </w:rPr>
+        <w:t>Performance Appraisal by Supervisor</w:t>
+      </w:r>
+      <w:r>
+        <w:rPr>
+          <w:rFonts w:ascii="Times New Roman" w:hAnsi="Times New Roman"/>
+          <w:b/>
+          <w:sz w:val="24"/>
+        </w:rPr>
+        <w:t>:</w:t>
+      </w:r>
+    </w:p>
+    <w:p>
+      <w:pPr>
+        <w:rPr>
+          <w:rFonts w:ascii="Times New Roman" w:hAnsi="Times New Roman"/>
+          <w:b/>
+          <w:sz w:val="24"/>
+        </w:rPr>
+      </w:pPr>
+      <w:r>
+        <w:rPr>
+          <w:rFonts w:ascii="Times New Roman" w:hAnsi="Times New Roman"/>
+          <w:b/>
+          <w:noProof/>
+          <w:sz w:val="24"/>
+          <w:lang w:eastAsia="en-GB" w:bidi="ne-NP"/>
+        </w:rPr>
+        <mc:AlternateContent>
+          <mc:Choice Requires="wps">
+            <w:drawing>
+              <wp:anchor distT="0" distB="0" distL="114300" distR="114300" simplePos="0" relativeHeight="251714560" behindDoc="0" locked="0" layoutInCell="1" allowOverlap="1" wp14:anchorId="0FDB04C4" wp14:editId="60527BAA">
+                <wp:simplePos x="0" y="0"/>
+                <wp:positionH relativeFrom="column">
+                  <wp:posOffset>9525</wp:posOffset>
+                </wp:positionH>
+                <wp:positionV relativeFrom="paragraph">
+                  <wp:posOffset>46355</wp:posOffset>
+                </wp:positionV>
+                <wp:extent cx="5857875" cy="819150"/>
+                <wp:effectExtent l="9525" t="9525" r="9525" b="9525"/>
+                <wp:wrapNone/>
+                <wp:docPr id="372504080" name="Rectangle 11"/>
+                <wp:cNvGraphicFramePr>
+                  <a:graphicFrameLocks xmlns:a="http://schemas.openxmlformats.org/drawingml/2006/main"/>
+                </wp:cNvGraphicFramePr>
+                <a:graphic xmlns:a="http://schemas.openxmlformats.org/drawingml/2006/main">
+                  <a:graphicData uri="http://schemas.microsoft.com/office/word/2010/wordprocessingShape">
+                    <wps:wsp>
+                      <wps:cNvSpPr>
+                        <a:spLocks noChangeArrowheads="1"/>
+                      </wps:cNvSpPr>
+                      <wps:spPr bwMode="auto">
+                        <a:xfrm>
+                          <a:off x="0" y="0"/>
+                          <a:ext cx="5857875" cy="819150"/>
+                        </a:xfrm>
+                        <a:prstGeom prst="rect">
+                          <a:avLst/>
+                        </a:prstGeom>
+                        <a:solidFill>
+                          <a:srgbClr val="FFFFFF"/>
+                        </a:solidFill>
+                        <a:ln w="9525">
+                          <a:solidFill>
+                            <a:srgbClr val="000000"/>
+                          </a:solidFill>
+                          <a:miter lim="800000"/>
+                          <a:headEnd/>
+                          <a:tailEnd/>
+                        </a:ln>
+                      </wps:spPr>
+                      <wps:bodyPr rot="0" vert="horz" wrap="square" lIns="91440" tIns="45720" rIns="91440" bIns="45720" anchor="t" anchorCtr="0" upright="1">
+                        <a:noAutofit/>
+                      </wps:bodyPr>
+                    </wps:wsp>
+                  </a:graphicData>
+                </a:graphic>
+                <wp14:sizeRelH relativeFrom="page">
+                  <wp14:pctWidth>0</wp14:pctWidth>
+                </wp14:sizeRelH>
+                <wp14:sizeRelV relativeFrom="page">
+                  <wp14:pctHeight>0</wp14:pctHeight>
+                </wp14:sizeRelV>
+              </wp:anchor>
+            </w:drawing>
+          </mc:Choice>
+          <mc:Fallback>
+            <w:pict>
+              <v:rect w14:anchorId="32586BB3" id="Rectangle 11" o:spid="_x0000_s1026" style="position:absolute;margin-left:.75pt;margin-top:3.65pt;width:461.25pt;height:64.5pt;z-index:251714560;visibility:visible;mso-wrap-style:square;mso-width-percent:0;mso-height-percent:0;mso-wrap-distance-left:9pt;mso-wrap-distance-top:0;mso-wrap-distance-right:9pt;mso-wrap-distance-bottom:0;mso-position-horizontal:absolute;mso-position-horizontal-relative:text;mso-position-vertical:absolute;mso-position-vertical-relative:text;mso-width-percent:0;mso-height-percent:0;mso-width-relative:page;mso-height-relative:page;v-text-anchor:top" o:gfxdata="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"/>
+            </w:pict>
+          </mc:Fallback>
+        </mc:AlternateContent>
+      </w:r>
+    </w:p>
+    <w:p>
+      <w:pPr>
+        <w:rPr>
+          <w:rFonts w:ascii="Times New Roman" w:hAnsi="Times New Roman"/>
+          <w:b/>
+          <w:sz w:val="24"/>
+        </w:rPr>
+      </w:pPr>
+    </w:p>
+    <w:p>
+      <w:pPr>
+        <w:rPr>
+          <w:rFonts w:ascii="Times New Roman" w:hAnsi="Times New Roman"/>
+          <w:b/>
+          <w:sz w:val="24"/>
+        </w:rPr>
+      </w:pPr>
+    </w:p>
+    <w:p>
+      <w:pPr>
+        <w:spacing w:line="240" w:lineRule="exact"/>
+        <w:rPr>
+          <w:rFonts w:ascii="Times New Roman" w:hAnsi="Times New Roman"/>
+          <w:b/>
+          <w:sz w:val="22"/>
+        </w:rPr>
+      </w:pPr>
+    </w:p>
+    <w:p>
+      <w:pPr>
+        <w:widowControl/>
+        <w:suppressAutoHyphens w:val="0"/>
+        <w:rPr>
+          <w:rFonts w:ascii="Times New Roman" w:hAnsi="Times New Roman"/>
+          <w:sz w:val="22"/>
+        </w:rPr>
+      </w:pPr>
+    </w:p>
+    <w:p>
+      <w:pPr>
+        <w:spacing w:line="240" w:lineRule="exact"/>
+        <w:rPr>
+          <w:rFonts w:ascii="Times New Roman" w:hAnsi="Times New Roman"/>
+          <w:sz w:val="22"/>
+        </w:rPr>
+      </w:pPr>
+      <w:r>
+        <w:rPr>
+          <w:rFonts w:ascii="Times New Roman" w:hAnsi="Times New Roman"/>
+          <w:sz w:val="22"/>
+        </w:rPr>
+        <w:tab/>
+      </w:r>
+    </w:p>
+    <w:p>
+      <w:pPr>
+        <w:rPr>
+          <w:rFonts w:ascii="Times New Roman" w:hAnsi="Times New Roman"/>
+          <w:b/>
+          <w:sz w:val="24"/>
+          <w:u w:val="single"/>
+        </w:rPr>
+      </w:pPr>
+      <w:r>
+        <w:rPr>
+          <w:rFonts w:ascii="Times New Roman" w:hAnsi="Times New Roman"/>
+          <w:b/>
+          <w:sz w:val="24"/>
+          <w:u w:val="single"/>
+        </w:rPr>
+        <w:t>Supervisor’s Approval</w:t>
+      </w:r>
+    </w:p>
+    <w:p>
+      <w:pPr>
+        <w:rPr>
+          <w:rFonts w:ascii="Times New Roman" w:hAnsi="Times New Roman"/>
+          <w:b/>
+          <w:sz w:val="24"/>
+        </w:rPr>
+      </w:pPr>
+    </w:p>
+    <w:p>
+      <w:pPr>
+        <w:rPr>
+          <w:rFonts w:ascii="Times New Roman" w:hAnsi="Times New Roman"/>
+          <w:b/>
+          <w:sz w:val="24"/>
+        </w:rPr>
+      </w:pPr>
+      <w:r>
+        <w:rPr>
+          <w:rFonts w:ascii="Times New Roman" w:hAnsi="Times New Roman"/>
+          <w:b/>
+          <w:sz w:val="24"/>
+        </w:rPr>
+        <w:t>Name:</w:t>
+      </w:r>
+      <w:r>
+        <w:rPr>
+          <w:rFonts w:ascii="Times New Roman" w:hAnsi="Times New Roman"/>
+          <w:b/>
+          <w:sz w:val="24"/>
+        </w:rPr>
+        <w:t xml:space="preserve"> </w:t>
+      </w:r>
+      <w:r>
+        <w:rPr>
+          <w:rFonts w:ascii="Times New Roman" w:hAnsi="Times New Roman"/>
+          <w:bCs/>
+          <w:sz w:val="24"/>
+        </w:rPr>
+        <w:t>Anish Dhamala</w:t>
+      </w:r>
+    </w:p>
+    <w:p>
+      <w:pPr>
+        <w:rPr>
+          <w:rFonts w:ascii="Times New Roman" w:hAnsi="Times New Roman"/>
+          <w:b/>
+          <w:sz w:val="24"/>
+        </w:rPr>
+      </w:pPr>
+    </w:p>
+    <w:p>
+      <w:pPr>
+        <w:rPr>
+          <w:rFonts w:ascii="Times New Roman" w:hAnsi="Times New Roman"/>
+          <w:b/>
+          <w:sz w:val="24"/>
+        </w:rPr>
+      </w:pPr>
+      <w:r>
+        <w:rPr>
+          <w:rFonts w:ascii="Times New Roman" w:hAnsi="Times New Roman"/>
+          <w:b/>
+          <w:sz w:val="24"/>
+        </w:rPr>
+        <w:t>Signature:</w:t>
+      </w:r>
+    </w:p>
+    <w:p>
+      <w:pPr>
+        <w:rPr>
+          <w:rFonts w:ascii="Times New Roman" w:hAnsi="Times New Roman"/>
+          <w:b/>
+          <w:sz w:val="24"/>
+        </w:rPr>
+      </w:pPr>
+      <w:r>
+        <w:rPr>
+          <w:rFonts w:ascii="Times New Roman" w:hAnsi="Times New Roman"/>
+          <w:b/>
+          <w:sz w:val="24"/>
+        </w:rPr>
+        <w:br w:type="column"/>
+      </w:r>
     </w:p>
     <w:sectPr>
       <w:pgSz w:w="12240" w:h="15840"/>
@@ -7708,6 +10787,95 @@
     </w:lvl>
   </w:abstractNum>
   <w:abstractNum w:abstractNumId="3" w15:restartNumberingAfterBreak="0">
+    <w:nsid w:val="070045CB"/>
+    <w:multiLevelType w:val="hybridMultilevel"/>
+    <w:tmpl w:val="C976384C"/>
+    <w:lvl w:ilvl="0" w:tplc="0409000F">
+      <w:start w:val="1"/>
+      <w:numFmt w:val="decimal"/>
+      <w:lvlText w:val="%1."/>
+      <w:lvlJc w:val="left"/>
+      <w:pPr>
+        <w:ind w:left="720" w:hanging="360"/>
+      </w:pPr>
+      <w:rPr>
+        <w:rFonts w:hint="default"/>
+      </w:rPr>
+    </w:lvl>
+    <w:lvl w:ilvl="1" w:tplc="04090019" w:tentative="1">
+      <w:start w:val="1"/>
+      <w:numFmt w:val="lowerLetter"/>
+      <w:lvlText w:val="%2."/>
+      <w:lvlJc w:val="left"/>
+      <w:pPr>
+        <w:ind w:left="1440" w:hanging="360"/>
+      </w:pPr>
+    </w:lvl>
+    <w:lvl w:ilvl="2" w:tplc="0409001B" w:tentative="1">
+      <w:start w:val="1"/>
+      <w:numFmt w:val="lowerRoman"/>
+      <w:lvlText w:val="%3."/>
+      <w:lvlJc w:val="right"/>
+      <w:pPr>
+        <w:ind w:left="2160" w:hanging="180"/>
+      </w:pPr>
+    </w:lvl>
+    <w:lvl w:ilvl="3" w:tplc="0409000F" w:tentative="1">
+      <w:start w:val="1"/>
+      <w:numFmt w:val="decimal"/>
+      <w:lvlText w:val="%4."/>
+      <w:lvlJc w:val="left"/>
+      <w:pPr>
+        <w:ind w:left="2880" w:hanging="360"/>
+      </w:pPr>
+    </w:lvl>
+    <w:lvl w:ilvl="4" w:tplc="04090019" w:tentative="1">
+      <w:start w:val="1"/>
+      <w:numFmt w:val="lowerLetter"/>
+      <w:lvlText w:val="%5."/>
+      <w:lvlJc w:val="left"/>
+      <w:pPr>
+        <w:ind w:left="3600" w:hanging="360"/>
+      </w:pPr>
+    </w:lvl>
+    <w:lvl w:ilvl="5" w:tplc="0409001B" w:tentative="1">
+      <w:start w:val="1"/>
+      <w:numFmt w:val="lowerRoman"/>
+      <w:lvlText w:val="%6."/>
+      <w:lvlJc w:val="right"/>
+      <w:pPr>
+        <w:ind w:left="4320" w:hanging="180"/>
+      </w:pPr>
+    </w:lvl>
+    <w:lvl w:ilvl="6" w:tplc="0409000F" w:tentative="1">
+      <w:start w:val="1"/>
+      <w:numFmt w:val="decimal"/>
+      <w:lvlText w:val="%7."/>
+      <w:lvlJc w:val="left"/>
+      <w:pPr>
+        <w:ind w:left="5040" w:hanging="360"/>
+      </w:pPr>
+    </w:lvl>
+    <w:lvl w:ilvl="7" w:tplc="04090019" w:tentative="1">
+      <w:start w:val="1"/>
+      <w:numFmt w:val="lowerLetter"/>
+      <w:lvlText w:val="%8."/>
+      <w:lvlJc w:val="left"/>
+      <w:pPr>
+        <w:ind w:left="5760" w:hanging="360"/>
+      </w:pPr>
+    </w:lvl>
+    <w:lvl w:ilvl="8" w:tplc="0409001B" w:tentative="1">
+      <w:start w:val="1"/>
+      <w:numFmt w:val="lowerRoman"/>
+      <w:lvlText w:val="%9."/>
+      <w:lvlJc w:val="right"/>
+      <w:pPr>
+        <w:ind w:left="6480" w:hanging="180"/>
+      </w:pPr>
+    </w:lvl>
+  </w:abstractNum>
+  <w:abstractNum w:abstractNumId="4" w15:restartNumberingAfterBreak="0">
     <w:nsid w:val="09DB3D5A"/>
     <w:multiLevelType w:val="hybridMultilevel"/>
     <w:tmpl w:val="69B22A6E"/>
@@ -7796,7 +10964,7 @@
       </w:pPr>
     </w:lvl>
   </w:abstractNum>
-  <w:abstractNum w:abstractNumId="4" w15:restartNumberingAfterBreak="0">
+  <w:abstractNum w:abstractNumId="5" w15:restartNumberingAfterBreak="0">
     <w:nsid w:val="154E77F1"/>
     <w:multiLevelType w:val="hybridMultilevel"/>
     <w:tmpl w:val="6818EAC2"/>
@@ -7909,7 +11077,274 @@
       </w:rPr>
     </w:lvl>
   </w:abstractNum>
-  <w:abstractNum w:abstractNumId="5" w15:restartNumberingAfterBreak="0">
+  <w:abstractNum w:abstractNumId="6" w15:restartNumberingAfterBreak="0">
+    <w:nsid w:val="18925E77"/>
+    <w:multiLevelType w:val="hybridMultilevel"/>
+    <w:tmpl w:val="EFF4ED98"/>
+    <w:lvl w:ilvl="0" w:tplc="0409000F">
+      <w:start w:val="1"/>
+      <w:numFmt w:val="decimal"/>
+      <w:lvlText w:val="%1."/>
+      <w:lvlJc w:val="left"/>
+      <w:pPr>
+        <w:ind w:left="720" w:hanging="360"/>
+      </w:pPr>
+      <w:rPr>
+        <w:rFonts w:hint="default"/>
+      </w:rPr>
+    </w:lvl>
+    <w:lvl w:ilvl="1" w:tplc="04090019" w:tentative="1">
+      <w:start w:val="1"/>
+      <w:numFmt w:val="lowerLetter"/>
+      <w:lvlText w:val="%2."/>
+      <w:lvlJc w:val="left"/>
+      <w:pPr>
+        <w:ind w:left="1440" w:hanging="360"/>
+      </w:pPr>
+    </w:lvl>
+    <w:lvl w:ilvl="2" w:tplc="0409001B" w:tentative="1">
+      <w:start w:val="1"/>
+      <w:numFmt w:val="lowerRoman"/>
+      <w:lvlText w:val="%3."/>
+      <w:lvlJc w:val="right"/>
+      <w:pPr>
+        <w:ind w:left="2160" w:hanging="180"/>
+      </w:pPr>
+    </w:lvl>
+    <w:lvl w:ilvl="3" w:tplc="0409000F" w:tentative="1">
+      <w:start w:val="1"/>
+      <w:numFmt w:val="decimal"/>
+      <w:lvlText w:val="%4."/>
+      <w:lvlJc w:val="left"/>
+      <w:pPr>
+        <w:ind w:left="2880" w:hanging="360"/>
+      </w:pPr>
+    </w:lvl>
+    <w:lvl w:ilvl="4" w:tplc="04090019" w:tentative="1">
+      <w:start w:val="1"/>
+      <w:numFmt w:val="lowerLetter"/>
+      <w:lvlText w:val="%5."/>
+      <w:lvlJc w:val="left"/>
+      <w:pPr>
+        <w:ind w:left="3600" w:hanging="360"/>
+      </w:pPr>
+    </w:lvl>
+    <w:lvl w:ilvl="5" w:tplc="0409001B" w:tentative="1">
+      <w:start w:val="1"/>
+      <w:numFmt w:val="lowerRoman"/>
+      <w:lvlText w:val="%6."/>
+      <w:lvlJc w:val="right"/>
+      <w:pPr>
+        <w:ind w:left="4320" w:hanging="180"/>
+      </w:pPr>
+    </w:lvl>
+    <w:lvl w:ilvl="6" w:tplc="0409000F" w:tentative="1">
+      <w:start w:val="1"/>
+      <w:numFmt w:val="decimal"/>
+      <w:lvlText w:val="%7."/>
+      <w:lvlJc w:val="left"/>
+      <w:pPr>
+        <w:ind w:left="5040" w:hanging="360"/>
+      </w:pPr>
+    </w:lvl>
+    <w:lvl w:ilvl="7" w:tplc="04090019" w:tentative="1">
+      <w:start w:val="1"/>
+      <w:numFmt w:val="lowerLetter"/>
+      <w:lvlText w:val="%8."/>
+      <w:lvlJc w:val="left"/>
+      <w:pPr>
+        <w:ind w:left="5760" w:hanging="360"/>
+      </w:pPr>
+    </w:lvl>
+    <w:lvl w:ilvl="8" w:tplc="0409001B" w:tentative="1">
+      <w:start w:val="1"/>
+      <w:numFmt w:val="lowerRoman"/>
+      <w:lvlText w:val="%9."/>
+      <w:lvlJc w:val="right"/>
+      <w:pPr>
+        <w:ind w:left="6480" w:hanging="180"/>
+      </w:pPr>
+    </w:lvl>
+  </w:abstractNum>
+  <w:abstractNum w:abstractNumId="7" w15:restartNumberingAfterBreak="0">
+    <w:nsid w:val="1FC5088C"/>
+    <w:multiLevelType w:val="hybridMultilevel"/>
+    <w:tmpl w:val="6E2CEB72"/>
+    <w:lvl w:ilvl="0" w:tplc="0409000F">
+      <w:start w:val="1"/>
+      <w:numFmt w:val="decimal"/>
+      <w:lvlText w:val="%1."/>
+      <w:lvlJc w:val="left"/>
+      <w:pPr>
+        <w:ind w:left="720" w:hanging="360"/>
+      </w:pPr>
+      <w:rPr>
+        <w:rFonts w:hint="default"/>
+      </w:rPr>
+    </w:lvl>
+    <w:lvl w:ilvl="1" w:tplc="04090019" w:tentative="1">
+      <w:start w:val="1"/>
+      <w:numFmt w:val="lowerLetter"/>
+      <w:lvlText w:val="%2."/>
+      <w:lvlJc w:val="left"/>
+      <w:pPr>
+        <w:ind w:left="1440" w:hanging="360"/>
+      </w:pPr>
+    </w:lvl>
+    <w:lvl w:ilvl="2" w:tplc="0409001B" w:tentative="1">
+      <w:start w:val="1"/>
+      <w:numFmt w:val="lowerRoman"/>
+      <w:lvlText w:val="%3."/>
+      <w:lvlJc w:val="right"/>
+      <w:pPr>
+        <w:ind w:left="2160" w:hanging="180"/>
+      </w:pPr>
+    </w:lvl>
+    <w:lvl w:ilvl="3" w:tplc="0409000F" w:tentative="1">
+      <w:start w:val="1"/>
+      <w:numFmt w:val="decimal"/>
+      <w:lvlText w:val="%4."/>
+      <w:lvlJc w:val="left"/>
+      <w:pPr>
+        <w:ind w:left="2880" w:hanging="360"/>
+      </w:pPr>
+    </w:lvl>
+    <w:lvl w:ilvl="4" w:tplc="04090019" w:tentative="1">
+      <w:start w:val="1"/>
+      <w:numFmt w:val="lowerLetter"/>
+      <w:lvlText w:val="%5."/>
+      <w:lvlJc w:val="left"/>
+      <w:pPr>
+        <w:ind w:left="3600" w:hanging="360"/>
+      </w:pPr>
+    </w:lvl>
+    <w:lvl w:ilvl="5" w:tplc="0409001B" w:tentative="1">
+      <w:start w:val="1"/>
+      <w:numFmt w:val="lowerRoman"/>
+      <w:lvlText w:val="%6."/>
+      <w:lvlJc w:val="right"/>
+      <w:pPr>
+        <w:ind w:left="4320" w:hanging="180"/>
+      </w:pPr>
+    </w:lvl>
+    <w:lvl w:ilvl="6" w:tplc="0409000F" w:tentative="1">
+      <w:start w:val="1"/>
+      <w:numFmt w:val="decimal"/>
+      <w:lvlText w:val="%7."/>
+      <w:lvlJc w:val="left"/>
+      <w:pPr>
+        <w:ind w:left="5040" w:hanging="360"/>
+      </w:pPr>
+    </w:lvl>
+    <w:lvl w:ilvl="7" w:tplc="04090019" w:tentative="1">
+      <w:start w:val="1"/>
+      <w:numFmt w:val="lowerLetter"/>
+      <w:lvlText w:val="%8."/>
+      <w:lvlJc w:val="left"/>
+      <w:pPr>
+        <w:ind w:left="5760" w:hanging="360"/>
+      </w:pPr>
+    </w:lvl>
+    <w:lvl w:ilvl="8" w:tplc="0409001B" w:tentative="1">
+      <w:start w:val="1"/>
+      <w:numFmt w:val="lowerRoman"/>
+      <w:lvlText w:val="%9."/>
+      <w:lvlJc w:val="right"/>
+      <w:pPr>
+        <w:ind w:left="6480" w:hanging="180"/>
+      </w:pPr>
+    </w:lvl>
+  </w:abstractNum>
+  <w:abstractNum w:abstractNumId="8" w15:restartNumberingAfterBreak="0">
+    <w:nsid w:val="3E242415"/>
+    <w:multiLevelType w:val="hybridMultilevel"/>
+    <w:tmpl w:val="DCC8A41A"/>
+    <w:lvl w:ilvl="0" w:tplc="0409000F">
+      <w:start w:val="1"/>
+      <w:numFmt w:val="decimal"/>
+      <w:lvlText w:val="%1."/>
+      <w:lvlJc w:val="left"/>
+      <w:pPr>
+        <w:ind w:left="720" w:hanging="360"/>
+      </w:pPr>
+      <w:rPr>
+        <w:rFonts w:hint="default"/>
+      </w:rPr>
+    </w:lvl>
+    <w:lvl w:ilvl="1" w:tplc="04090019" w:tentative="1">
+      <w:start w:val="1"/>
+      <w:numFmt w:val="lowerLetter"/>
+      <w:lvlText w:val="%2."/>
+      <w:lvlJc w:val="left"/>
+      <w:pPr>
+        <w:ind w:left="1440" w:hanging="360"/>
+      </w:pPr>
+    </w:lvl>
+    <w:lvl w:ilvl="2" w:tplc="0409001B" w:tentative="1">
+      <w:start w:val="1"/>
+      <w:numFmt w:val="lowerRoman"/>
+      <w:lvlText w:val="%3."/>
+      <w:lvlJc w:val="right"/>
+      <w:pPr>
+        <w:ind w:left="2160" w:hanging="180"/>
+      </w:pPr>
+    </w:lvl>
+    <w:lvl w:ilvl="3" w:tplc="0409000F" w:tentative="1">
+      <w:start w:val="1"/>
+      <w:numFmt w:val="decimal"/>
+      <w:lvlText w:val="%4."/>
+      <w:lvlJc w:val="left"/>
+      <w:pPr>
+        <w:ind w:left="2880" w:hanging="360"/>
+      </w:pPr>
+    </w:lvl>
+    <w:lvl w:ilvl="4" w:tplc="04090019" w:tentative="1">
+      <w:start w:val="1"/>
+      <w:numFmt w:val="lowerLetter"/>
+      <w:lvlText w:val="%5."/>
+      <w:lvlJc w:val="left"/>
+      <w:pPr>
+        <w:ind w:left="3600" w:hanging="360"/>
+      </w:pPr>
+    </w:lvl>
+    <w:lvl w:ilvl="5" w:tplc="0409001B" w:tentative="1">
+      <w:start w:val="1"/>
+      <w:numFmt w:val="lowerRoman"/>
+      <w:lvlText w:val="%6."/>
+      <w:lvlJc w:val="right"/>
+      <w:pPr>
+        <w:ind w:left="4320" w:hanging="180"/>
+      </w:pPr>
+    </w:lvl>
+    <w:lvl w:ilvl="6" w:tplc="0409000F" w:tentative="1">
+      <w:start w:val="1"/>
+      <w:numFmt w:val="decimal"/>
+      <w:lvlText w:val="%7."/>
+      <w:lvlJc w:val="left"/>
+      <w:pPr>
+        <w:ind w:left="5040" w:hanging="360"/>
+      </w:pPr>
+    </w:lvl>
+    <w:lvl w:ilvl="7" w:tplc="04090019" w:tentative="1">
+      <w:start w:val="1"/>
+      <w:numFmt w:val="lowerLetter"/>
+      <w:lvlText w:val="%8."/>
+      <w:lvlJc w:val="left"/>
+      <w:pPr>
+        <w:ind w:left="5760" w:hanging="360"/>
+      </w:pPr>
+    </w:lvl>
+    <w:lvl w:ilvl="8" w:tplc="0409001B" w:tentative="1">
+      <w:start w:val="1"/>
+      <w:numFmt w:val="lowerRoman"/>
+      <w:lvlText w:val="%9."/>
+      <w:lvlJc w:val="right"/>
+      <w:pPr>
+        <w:ind w:left="6480" w:hanging="180"/>
+      </w:pPr>
+    </w:lvl>
+  </w:abstractNum>
+  <w:abstractNum w:abstractNumId="9" w15:restartNumberingAfterBreak="0">
     <w:nsid w:val="3EDD6A10"/>
     <w:multiLevelType w:val="hybridMultilevel"/>
     <w:tmpl w:val="6F720214"/>
@@ -8022,7 +11457,7 @@
       </w:rPr>
     </w:lvl>
   </w:abstractNum>
-  <w:abstractNum w:abstractNumId="6" w15:restartNumberingAfterBreak="0">
+  <w:abstractNum w:abstractNumId="10" w15:restartNumberingAfterBreak="0">
     <w:nsid w:val="43DB5BD7"/>
     <w:multiLevelType w:val="hybridMultilevel"/>
     <w:tmpl w:val="09CE8FAE"/>
@@ -8135,7 +11570,7 @@
       </w:rPr>
     </w:lvl>
   </w:abstractNum>
-  <w:abstractNum w:abstractNumId="7" w15:restartNumberingAfterBreak="0">
+  <w:abstractNum w:abstractNumId="11" w15:restartNumberingAfterBreak="0">
     <w:nsid w:val="4DA91331"/>
     <w:multiLevelType w:val="hybridMultilevel"/>
     <w:tmpl w:val="5FF4817C"/>
@@ -8248,7 +11683,7 @@
       </w:rPr>
     </w:lvl>
   </w:abstractNum>
-  <w:abstractNum w:abstractNumId="8" w15:restartNumberingAfterBreak="0">
+  <w:abstractNum w:abstractNumId="12" w15:restartNumberingAfterBreak="0">
     <w:nsid w:val="5E121EF0"/>
     <w:multiLevelType w:val="hybridMultilevel"/>
     <w:tmpl w:val="F3C2E434"/>
@@ -8337,7 +11772,7 @@
       </w:pPr>
     </w:lvl>
   </w:abstractNum>
-  <w:abstractNum w:abstractNumId="9" w15:restartNumberingAfterBreak="0">
+  <w:abstractNum w:abstractNumId="13" w15:restartNumberingAfterBreak="0">
     <w:nsid w:val="5ECF078F"/>
     <w:multiLevelType w:val="hybridMultilevel"/>
     <w:tmpl w:val="7E12F3EE"/>
@@ -8450,7 +11885,7 @@
       </w:rPr>
     </w:lvl>
   </w:abstractNum>
-  <w:abstractNum w:abstractNumId="10" w15:restartNumberingAfterBreak="0">
+  <w:abstractNum w:abstractNumId="14" w15:restartNumberingAfterBreak="0">
     <w:nsid w:val="685F40AC"/>
     <w:multiLevelType w:val="hybridMultilevel"/>
     <w:tmpl w:val="85FCB000"/>
@@ -8563,7 +11998,7 @@
       </w:rPr>
     </w:lvl>
   </w:abstractNum>
-  <w:abstractNum w:abstractNumId="11" w15:restartNumberingAfterBreak="0">
+  <w:abstractNum w:abstractNumId="15" w15:restartNumberingAfterBreak="0">
     <w:nsid w:val="6DBD288C"/>
     <w:multiLevelType w:val="hybridMultilevel"/>
     <w:tmpl w:val="C5F6F5BA"/>
@@ -8652,7 +12087,96 @@
       </w:pPr>
     </w:lvl>
   </w:abstractNum>
-  <w:abstractNum w:abstractNumId="12" w15:restartNumberingAfterBreak="0">
+  <w:abstractNum w:abstractNumId="16" w15:restartNumberingAfterBreak="0">
+    <w:nsid w:val="6E11586A"/>
+    <w:multiLevelType w:val="hybridMultilevel"/>
+    <w:tmpl w:val="7BCE281A"/>
+    <w:lvl w:ilvl="0" w:tplc="0409000F">
+      <w:start w:val="1"/>
+      <w:numFmt w:val="decimal"/>
+      <w:lvlText w:val="%1."/>
+      <w:lvlJc w:val="left"/>
+      <w:pPr>
+        <w:ind w:left="720" w:hanging="360"/>
+      </w:pPr>
+      <w:rPr>
+        <w:rFonts w:hint="default"/>
+      </w:rPr>
+    </w:lvl>
+    <w:lvl w:ilvl="1" w:tplc="04090019" w:tentative="1">
+      <w:start w:val="1"/>
+      <w:numFmt w:val="lowerLetter"/>
+      <w:lvlText w:val="%2."/>
+      <w:lvlJc w:val="left"/>
+      <w:pPr>
+        <w:ind w:left="1440" w:hanging="360"/>
+      </w:pPr>
+    </w:lvl>
+    <w:lvl w:ilvl="2" w:tplc="0409001B" w:tentative="1">
+      <w:start w:val="1"/>
+      <w:numFmt w:val="lowerRoman"/>
+      <w:lvlText w:val="%3."/>
+      <w:lvlJc w:val="right"/>
+      <w:pPr>
+        <w:ind w:left="2160" w:hanging="180"/>
+      </w:pPr>
+    </w:lvl>
+    <w:lvl w:ilvl="3" w:tplc="0409000F" w:tentative="1">
+      <w:start w:val="1"/>
+      <w:numFmt w:val="decimal"/>
+      <w:lvlText w:val="%4."/>
+      <w:lvlJc w:val="left"/>
+      <w:pPr>
+        <w:ind w:left="2880" w:hanging="360"/>
+      </w:pPr>
+    </w:lvl>
+    <w:lvl w:ilvl="4" w:tplc="04090019" w:tentative="1">
+      <w:start w:val="1"/>
+      <w:numFmt w:val="lowerLetter"/>
+      <w:lvlText w:val="%5."/>
+      <w:lvlJc w:val="left"/>
+      <w:pPr>
+        <w:ind w:left="3600" w:hanging="360"/>
+      </w:pPr>
+    </w:lvl>
+    <w:lvl w:ilvl="5" w:tplc="0409001B" w:tentative="1">
+      <w:start w:val="1"/>
+      <w:numFmt w:val="lowerRoman"/>
+      <w:lvlText w:val="%6."/>
+      <w:lvlJc w:val="right"/>
+      <w:pPr>
+        <w:ind w:left="4320" w:hanging="180"/>
+      </w:pPr>
+    </w:lvl>
+    <w:lvl w:ilvl="6" w:tplc="0409000F" w:tentative="1">
+      <w:start w:val="1"/>
+      <w:numFmt w:val="decimal"/>
+      <w:lvlText w:val="%7."/>
+      <w:lvlJc w:val="left"/>
+      <w:pPr>
+        <w:ind w:left="5040" w:hanging="360"/>
+      </w:pPr>
+    </w:lvl>
+    <w:lvl w:ilvl="7" w:tplc="04090019" w:tentative="1">
+      <w:start w:val="1"/>
+      <w:numFmt w:val="lowerLetter"/>
+      <w:lvlText w:val="%8."/>
+      <w:lvlJc w:val="left"/>
+      <w:pPr>
+        <w:ind w:left="5760" w:hanging="360"/>
+      </w:pPr>
+    </w:lvl>
+    <w:lvl w:ilvl="8" w:tplc="0409001B" w:tentative="1">
+      <w:start w:val="1"/>
+      <w:numFmt w:val="lowerRoman"/>
+      <w:lvlText w:val="%9."/>
+      <w:lvlJc w:val="right"/>
+      <w:pPr>
+        <w:ind w:left="6480" w:hanging="180"/>
+      </w:pPr>
+    </w:lvl>
+  </w:abstractNum>
+  <w:abstractNum w:abstractNumId="17" w15:restartNumberingAfterBreak="0">
     <w:nsid w:val="7FC744A6"/>
     <w:multiLevelType w:val="hybridMultilevel"/>
     <w:tmpl w:val="7C1CAD1A"/>
@@ -8745,40 +12269,55 @@
     <w:abstractNumId w:val="0"/>
   </w:num>
   <w:num w:numId="2" w16cid:durableId="2129856123">
-    <w:abstractNumId w:val="6"/>
+    <w:abstractNumId w:val="10"/>
   </w:num>
   <w:num w:numId="3" w16cid:durableId="2083678365">
     <w:abstractNumId w:val="1"/>
   </w:num>
   <w:num w:numId="4" w16cid:durableId="853615146">
-    <w:abstractNumId w:val="4"/>
+    <w:abstractNumId w:val="5"/>
   </w:num>
   <w:num w:numId="5" w16cid:durableId="224679271">
-    <w:abstractNumId w:val="5"/>
+    <w:abstractNumId w:val="9"/>
   </w:num>
   <w:num w:numId="6" w16cid:durableId="1500610262">
-    <w:abstractNumId w:val="10"/>
+    <w:abstractNumId w:val="14"/>
   </w:num>
   <w:num w:numId="7" w16cid:durableId="161627159">
-    <w:abstractNumId w:val="8"/>
+    <w:abstractNumId w:val="12"/>
   </w:num>
   <w:num w:numId="8" w16cid:durableId="382218738">
     <w:abstractNumId w:val="2"/>
   </w:num>
   <w:num w:numId="9" w16cid:durableId="1659452967">
-    <w:abstractNumId w:val="9"/>
+    <w:abstractNumId w:val="13"/>
   </w:num>
   <w:num w:numId="10" w16cid:durableId="1914508029">
+    <w:abstractNumId w:val="4"/>
+  </w:num>
+  <w:num w:numId="11" w16cid:durableId="423378426">
+    <w:abstractNumId w:val="11"/>
+  </w:num>
+  <w:num w:numId="12" w16cid:durableId="254826577">
+    <w:abstractNumId w:val="15"/>
+  </w:num>
+  <w:num w:numId="13" w16cid:durableId="2146001404">
+    <w:abstractNumId w:val="17"/>
+  </w:num>
+  <w:num w:numId="14" w16cid:durableId="2088920724">
+    <w:abstractNumId w:val="6"/>
+  </w:num>
+  <w:num w:numId="15" w16cid:durableId="1877155660">
+    <w:abstractNumId w:val="8"/>
+  </w:num>
+  <w:num w:numId="16" w16cid:durableId="1978143576">
+    <w:abstractNumId w:val="16"/>
+  </w:num>
+  <w:num w:numId="17" w16cid:durableId="1128086023">
     <w:abstractNumId w:val="3"/>
   </w:num>
-  <w:num w:numId="11" w16cid:durableId="423378426">
+  <w:num w:numId="18" w16cid:durableId="442575712">
     <w:abstractNumId w:val="7"/>
-  </w:num>
-  <w:num w:numId="12" w16cid:durableId="254826577">
-    <w:abstractNumId w:val="11"/>
-  </w:num>
-  <w:num w:numId="13" w16cid:durableId="2146001404">
-    <w:abstractNumId w:val="12"/>
   </w:num>
 </w:numbering>
 </file>
@@ -9168,7 +12707,7 @@
   <w:style w:type="paragraph" w:default="1" w:styleId="Normal">
     <w:name w:val="Normal"/>
     <w:qFormat/>
-    <w:rsid w:val="00407587"/>
+    <w:rsid w:val="005C1329"/>
     <w:pPr>
       <w:widowControl w:val="0"/>
       <w:suppressAutoHyphens/>
@@ -9592,9 +13131,12 @@
 </file>
 
 <file path=customXml/item1.xml><?xml version="1.0" encoding="utf-8"?>
-<p:properties xmlns:p="http://schemas.microsoft.com/office/2006/metadata/properties" xmlns:xsi="http://www.w3.org/2001/XMLSchema-instance" xmlns:pc="http://schemas.microsoft.com/office/infopath/2007/PartnerControls">
-  <documentManagement/>
-</p:properties>
+<?mso-contentType ?>
+<FormTemplates xmlns="http://schemas.microsoft.com/sharepoint/v3/contenttype/forms">
+  <Display>DocumentLibraryForm</Display>
+  <Edit>DocumentLibraryForm</Edit>
+  <New>DocumentLibraryForm</New>
+</FormTemplates>
 </file>
 
 <file path=customXml/item2.xml><?xml version="1.0" encoding="utf-8"?>
@@ -9815,19 +13357,15 @@
 </file>
 
 <file path=customXml/item3.xml><?xml version="1.0" encoding="utf-8"?>
-<?mso-contentType ?>
-<FormTemplates xmlns="http://schemas.microsoft.com/sharepoint/v3/contenttype/forms">
-  <Display>DocumentLibraryForm</Display>
-  <Edit>DocumentLibraryForm</Edit>
-  <New>DocumentLibraryForm</New>
-</FormTemplates>
+<p:properties xmlns:p="http://schemas.microsoft.com/office/2006/metadata/properties" xmlns:xsi="http://www.w3.org/2001/XMLSchema-instance" xmlns:pc="http://schemas.microsoft.com/office/infopath/2007/PartnerControls">
+  <documentManagement/>
+</p:properties>
 </file>
 
 <file path=customXml/itemProps1.xml><?xml version="1.0" encoding="utf-8"?>
-<ds:datastoreItem xmlns:ds="http://schemas.openxmlformats.org/officeDocument/2006/customXml" ds:itemID="{B3F33E58-36DF-4EBC-A4A8-C29B49A3EC38}">
+<ds:datastoreItem xmlns:ds="http://schemas.openxmlformats.org/officeDocument/2006/customXml" ds:itemID="{BA53FE5F-2542-4B2F-9BBE-17CA29EA39A8}">
   <ds:schemaRefs>
-    <ds:schemaRef ds:uri="http://schemas.microsoft.com/office/2006/metadata/properties"/>
-    <ds:schemaRef ds:uri="http://schemas.microsoft.com/office/infopath/2007/PartnerControls"/>
+    <ds:schemaRef ds:uri="http://schemas.microsoft.com/sharepoint/v3/contenttype/forms"/>
   </ds:schemaRefs>
 </ds:datastoreItem>
 </file>
@@ -9852,9 +13390,10 @@
 </file>
 
 <file path=customXml/itemProps3.xml><?xml version="1.0" encoding="utf-8"?>
-<ds:datastoreItem xmlns:ds="http://schemas.openxmlformats.org/officeDocument/2006/customXml" ds:itemID="{BA53FE5F-2542-4B2F-9BBE-17CA29EA39A8}">
+<ds:datastoreItem xmlns:ds="http://schemas.openxmlformats.org/officeDocument/2006/customXml" ds:itemID="{B3F33E58-36DF-4EBC-A4A8-C29B49A3EC38}">
   <ds:schemaRefs>
-    <ds:schemaRef ds:uri="http://schemas.microsoft.com/sharepoint/v3/contenttype/forms"/>
+    <ds:schemaRef ds:uri="http://schemas.microsoft.com/office/2006/metadata/properties"/>
+    <ds:schemaRef ds:uri="http://schemas.microsoft.com/office/infopath/2007/PartnerControls"/>
   </ds:schemaRefs>
 </ds:datastoreItem>
 </file>
</xml_diff>